<commit_message>
add new doc: requerimientos funcionales: FOR NOW ADD TWO: User management and role management
</commit_message>
<xml_diff>
--- a/01-Documentation/03-FunctionalRequeriments/FunctionalRequeriments.docx
+++ b/01-Documentation/03-FunctionalRequeriments/FunctionalRequeriments.docx
@@ -3,48 +3,632 @@
 <w:document xmlns:wpc="http://schemas.microsoft.com/office/word/2010/wordprocessingCanvas" xmlns:cx="http://schemas.microsoft.com/office/drawing/2014/chartex" xmlns:cx1="http://schemas.microsoft.com/office/drawing/2015/9/8/chartex" xmlns:cx2="http://schemas.microsoft.com/office/drawing/2015/10/21/chartex" xmlns:cx3="http://schemas.microsoft.com/office/drawing/2016/5/9/chartex" xmlns:cx4="http://schemas.microsoft.com/office/drawing/2016/5/10/chartex" xmlns:cx5="http://schemas.microsoft.com/office/drawing/2016/5/11/chartex" xmlns:cx6="http://schemas.microsoft.com/office/drawing/2016/5/12/chartex" xmlns:cx7="http://schemas.microsoft.com/office/drawing/2016/5/13/chartex" xmlns:cx8="http://schemas.microsoft.com/office/drawing/2016/5/14/chartex" xmlns:mc="http://schemas.openxmlformats.org/markup-compatibility/2006" xmlns:aink="http://schemas.microsoft.com/office/drawing/2016/ink" xmlns:am3d="http://schemas.microsoft.com/office/drawing/2017/model3d" xmlns:o="urn:schemas-microsoft-com:office:office" xmlns:oel="http://schemas.microsoft.com/office/2019/extlst" xmlns:r="http://schemas.openxmlformats.org/officeDocument/2006/relationships" xmlns:m="http://schemas.openxmlformats.org/officeDocument/2006/math" xmlns:v="urn:schemas-microsoft-com:vml" xmlns:wp14="http://schemas.microsoft.com/office/word/2010/wordprocessingDrawing" xmlns:wp="http://schemas.openxmlformats.org/drawingml/2006/wordprocessingDrawing" xmlns:w10="urn:schemas-microsoft-com:office:word" xmlns:w="http://schemas.openxmlformats.org/wordprocessingml/2006/main" xmlns:w14="http://schemas.microsoft.com/office/word/2010/wordml" xmlns:w15="http://schemas.microsoft.com/office/word/2012/wordml" xmlns:w16cex="http://schemas.microsoft.com/office/word/2018/wordml/cex" xmlns:w16cid="http://schemas.microsoft.com/office/word/2016/wordml/cid" xmlns:w16="http://schemas.microsoft.com/office/word/2018/wordml" xmlns:w16du="http://schemas.microsoft.com/office/word/2023/wordml/word16du" xmlns:w16sdtdh="http://schemas.microsoft.com/office/word/2020/wordml/sdtdatahash" xmlns:w16se="http://schemas.microsoft.com/office/word/2015/wordml/symex" xmlns:wpg="http://schemas.microsoft.com/office/word/2010/wordprocessingGroup" xmlns:wpi="http://schemas.microsoft.com/office/word/2010/wordprocessingInk" xmlns:wne="http://schemas.microsoft.com/office/word/2006/wordml" xmlns:wps="http://schemas.microsoft.com/office/word/2010/wordprocessingShape" mc:Ignorable="w14 w15 w16se w16cid w16 w16cex w16sdtdh wp14">
   <w:body>
     <w:p/>
-    <w:p/>
-    <w:p/>
-    <w:p/>
-    <w:p/>
-    <w:p/>
-    <w:p/>
-    <w:p/>
-    <w:p/>
-    <w:p/>
-    <w:p/>
-    <w:p/>
-    <w:p/>
-    <w:p/>
-    <w:p/>
-    <w:p/>
-    <w:p/>
-    <w:p/>
-    <w:p/>
-    <w:p/>
-    <w:p/>
-    <w:p/>
-    <w:p/>
-    <w:p/>
-    <w:p/>
-    <w:p/>
-    <w:p/>
-    <w:p/>
-    <w:p/>
-    <w:p/>
+    <w:p>
+      <w:pPr>
+        <w:jc w:val="center"/>
+        <w:rPr>
+          <w:rFonts w:ascii="Algerian" w:hAnsi="Algerian"/>
+          <w:color w:val="47D459" w:themeColor="accent3" w:themeTint="99"/>
+          <w:lang w:val="en-US"/>
+        </w:rPr>
+      </w:pPr>
+      <w:r>
+        <w:rPr>
+          <w:rFonts w:ascii="Algerian" w:hAnsi="Algerian"/>
+          <w:color w:val="47D459" w:themeColor="accent3" w:themeTint="99"/>
+          <w:lang w:val="en-US"/>
+        </w:rPr>
+        <w:t xml:space="preserve">Functional </w:t>
+      </w:r>
+      <w:proofErr w:type="spellStart"/>
+      <w:r>
+        <w:rPr>
+          <w:rFonts w:ascii="Algerian" w:hAnsi="Algerian"/>
+          <w:color w:val="47D459" w:themeColor="accent3" w:themeTint="99"/>
+          <w:lang w:val="en-US"/>
+        </w:rPr>
+        <w:t>requeriments</w:t>
+      </w:r>
+      <w:proofErr w:type="spellEnd"/>
+      <w:r>
+        <w:rPr>
+          <w:rFonts w:ascii="Algerian" w:hAnsi="Algerian"/>
+          <w:color w:val="47D459" w:themeColor="accent3" w:themeTint="99"/>
+          <w:lang w:val="en-US"/>
+        </w:rPr>
+        <w:t xml:space="preserve"> – </w:t>
+      </w:r>
+      <w:proofErr w:type="spellStart"/>
+      <w:r>
+        <w:rPr>
+          <w:rFonts w:ascii="Algerian" w:hAnsi="Algerian"/>
+          <w:color w:val="47D459" w:themeColor="accent3" w:themeTint="99"/>
+          <w:lang w:val="en-US"/>
+        </w:rPr>
+        <w:t>AgroBrain</w:t>
+      </w:r>
+      <w:proofErr w:type="spellEnd"/>
+    </w:p>
+    <w:p>
+      <w:pPr>
+        <w:pStyle w:val="Heading1"/>
+        <w:rPr>
+          <w:lang w:val="en-US"/>
+        </w:rPr>
+      </w:pPr>
+      <w:r>
+        <w:rPr>
+          <w:noProof/>
+          <w:lang w:val="en-US"/>
+        </w:rPr>
+        <mc:AlternateContent>
+          <mc:Choice Requires="wps">
+            <w:drawing>
+              <wp:anchor distT="0" distB="0" distL="114300" distR="114300" simplePos="0" relativeHeight="251659264" behindDoc="0" locked="0" layoutInCell="1" allowOverlap="1" wp14:anchorId="727F9C26" wp14:editId="4E1BF195">
+                <wp:simplePos x="0" y="0"/>
+                <wp:positionH relativeFrom="column">
+                  <wp:posOffset>2226945</wp:posOffset>
+                </wp:positionH>
+                <wp:positionV relativeFrom="paragraph">
+                  <wp:posOffset>259080</wp:posOffset>
+                </wp:positionV>
+                <wp:extent cx="3810000" cy="0"/>
+                <wp:effectExtent l="0" t="0" r="0" b="0"/>
+                <wp:wrapNone/>
+                <wp:docPr id="949730596" name="Straight Connector 1"/>
+                <wp:cNvGraphicFramePr/>
+                <a:graphic xmlns:a="http://schemas.openxmlformats.org/drawingml/2006/main">
+                  <a:graphicData uri="http://schemas.microsoft.com/office/word/2010/wordprocessingShape">
+                    <wps:wsp>
+                      <wps:cNvCnPr/>
+                      <wps:spPr>
+                        <a:xfrm>
+                          <a:off x="0" y="0"/>
+                          <a:ext cx="3810000" cy="0"/>
+                        </a:xfrm>
+                        <a:prstGeom prst="line">
+                          <a:avLst/>
+                        </a:prstGeom>
+                        <a:ln w="19050"/>
+                      </wps:spPr>
+                      <wps:style>
+                        <a:lnRef idx="2">
+                          <a:schemeClr val="accent1"/>
+                        </a:lnRef>
+                        <a:fillRef idx="0">
+                          <a:schemeClr val="accent1"/>
+                        </a:fillRef>
+                        <a:effectRef idx="1">
+                          <a:schemeClr val="accent1"/>
+                        </a:effectRef>
+                        <a:fontRef idx="minor">
+                          <a:schemeClr val="tx1"/>
+                        </a:fontRef>
+                      </wps:style>
+                      <wps:bodyPr/>
+                    </wps:wsp>
+                  </a:graphicData>
+                </a:graphic>
+              </wp:anchor>
+            </w:drawing>
+          </mc:Choice>
+          <mc:Fallback>
+            <w:pict>
+              <v:line w14:anchorId="399ADE57" id="Straight Connector 1" o:spid="_x0000_s1026" style="position:absolute;z-index:251659264;visibility:visible;mso-wrap-style:square;mso-wrap-distance-left:9pt;mso-wrap-distance-top:0;mso-wrap-distance-right:9pt;mso-wrap-distance-bottom:0;mso-position-horizontal:absolute;mso-position-horizontal-relative:text;mso-position-vertical:absolute;mso-position-vertical-relative:text" from="175.35pt,20.4pt" to="475.35pt,20.4pt" o:gfxdata="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" strokecolor="#156082 [3204]" strokeweight="1.5pt">
+                <v:stroke joinstyle="miter"/>
+              </v:line>
+            </w:pict>
+          </mc:Fallback>
+        </mc:AlternateContent>
+      </w:r>
+      <w:r>
+        <w:rPr>
+          <w:lang w:val="en-US"/>
+        </w:rPr>
+        <w:t>RF-001 Us</w:t>
+      </w:r>
+      <w:r>
+        <w:rPr>
+          <w:lang w:val="en-US"/>
+        </w:rPr>
+        <w:t xml:space="preserve">er Management </w:t>
+      </w:r>
+    </w:p>
+    <w:p>
+      <w:pPr>
+        <w:rPr>
+          <w:lang w:val="en-US"/>
+        </w:rPr>
+      </w:pPr>
+    </w:p>
+    <w:p>
+      <w:pPr>
+        <w:rPr>
+          <w:lang w:val="en-US"/>
+        </w:rPr>
+      </w:pPr>
+      <w:r>
+        <w:rPr>
+          <w:lang w:val="en-US"/>
+        </w:rPr>
+        <w:t xml:space="preserve">The System shall allow the registration, modification, querying, and deactivation of </w:t>
+      </w:r>
+      <w:proofErr w:type="gramStart"/>
+      <w:r>
+        <w:rPr>
+          <w:lang w:val="en-US"/>
+        </w:rPr>
+        <w:t>users</w:t>
+      </w:r>
+      <w:proofErr w:type="gramEnd"/>
+    </w:p>
+    <w:p>
+      <w:pPr>
+        <w:pStyle w:val="Heading1"/>
+        <w:rPr>
+          <w:lang w:val="en-US"/>
+        </w:rPr>
+      </w:pPr>
+      <w:r>
+        <w:rPr>
+          <w:noProof/>
+          <w:lang w:val="en-US"/>
+        </w:rPr>
+        <mc:AlternateContent>
+          <mc:Choice Requires="wps">
+            <w:drawing>
+              <wp:anchor distT="0" distB="0" distL="114300" distR="114300" simplePos="0" relativeHeight="251661312" behindDoc="0" locked="0" layoutInCell="1" allowOverlap="1" wp14:anchorId="2CAEDF26" wp14:editId="4BB370F9">
+                <wp:simplePos x="0" y="0"/>
+                <wp:positionH relativeFrom="column">
+                  <wp:posOffset>2226945</wp:posOffset>
+                </wp:positionH>
+                <wp:positionV relativeFrom="paragraph">
+                  <wp:posOffset>259080</wp:posOffset>
+                </wp:positionV>
+                <wp:extent cx="3810000" cy="0"/>
+                <wp:effectExtent l="0" t="0" r="0" b="0"/>
+                <wp:wrapNone/>
+                <wp:docPr id="1669395248" name="Straight Connector 1"/>
+                <wp:cNvGraphicFramePr/>
+                <a:graphic xmlns:a="http://schemas.openxmlformats.org/drawingml/2006/main">
+                  <a:graphicData uri="http://schemas.microsoft.com/office/word/2010/wordprocessingShape">
+                    <wps:wsp>
+                      <wps:cNvCnPr/>
+                      <wps:spPr>
+                        <a:xfrm>
+                          <a:off x="0" y="0"/>
+                          <a:ext cx="3810000" cy="0"/>
+                        </a:xfrm>
+                        <a:prstGeom prst="line">
+                          <a:avLst/>
+                        </a:prstGeom>
+                        <a:ln w="19050"/>
+                      </wps:spPr>
+                      <wps:style>
+                        <a:lnRef idx="2">
+                          <a:schemeClr val="accent1"/>
+                        </a:lnRef>
+                        <a:fillRef idx="0">
+                          <a:schemeClr val="accent1"/>
+                        </a:fillRef>
+                        <a:effectRef idx="1">
+                          <a:schemeClr val="accent1"/>
+                        </a:effectRef>
+                        <a:fontRef idx="minor">
+                          <a:schemeClr val="tx1"/>
+                        </a:fontRef>
+                      </wps:style>
+                      <wps:bodyPr/>
+                    </wps:wsp>
+                  </a:graphicData>
+                </a:graphic>
+              </wp:anchor>
+            </w:drawing>
+          </mc:Choice>
+          <mc:Fallback>
+            <w:pict>
+              <v:line w14:anchorId="109CC519" id="Straight Connector 1" o:spid="_x0000_s1026" style="position:absolute;z-index:251661312;visibility:visible;mso-wrap-style:square;mso-wrap-distance-left:9pt;mso-wrap-distance-top:0;mso-wrap-distance-right:9pt;mso-wrap-distance-bottom:0;mso-position-horizontal:absolute;mso-position-horizontal-relative:text;mso-position-vertical:absolute;mso-position-vertical-relative:text" from="175.35pt,20.4pt" to="475.35pt,20.4pt" o:gfxdata="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" strokecolor="#156082 [3204]" strokeweight="1.5pt">
+                <v:stroke joinstyle="miter"/>
+              </v:line>
+            </w:pict>
+          </mc:Fallback>
+        </mc:AlternateContent>
+      </w:r>
+      <w:r>
+        <w:rPr>
+          <w:lang w:val="en-US"/>
+        </w:rPr>
+        <w:t>RF-00</w:t>
+      </w:r>
+      <w:r>
+        <w:rPr>
+          <w:lang w:val="en-US"/>
+        </w:rPr>
+        <w:t>2</w:t>
+      </w:r>
+      <w:r>
+        <w:rPr>
+          <w:lang w:val="en-US"/>
+        </w:rPr>
+        <w:t xml:space="preserve"> </w:t>
+      </w:r>
+      <w:r>
+        <w:rPr>
+          <w:lang w:val="en-US"/>
+        </w:rPr>
+        <w:t>Role Management</w:t>
+      </w:r>
+      <w:r>
+        <w:rPr>
+          <w:lang w:val="en-US"/>
+        </w:rPr>
+        <w:t xml:space="preserve"> </w:t>
+      </w:r>
+    </w:p>
+    <w:p>
+      <w:pPr>
+        <w:rPr>
+          <w:lang w:val="en-US"/>
+        </w:rPr>
+      </w:pPr>
+    </w:p>
+    <w:p>
+      <w:pPr>
+        <w:rPr>
+          <w:lang w:val="en-US"/>
+        </w:rPr>
+      </w:pPr>
+      <w:r>
+        <w:rPr>
+          <w:lang w:val="en-US"/>
+        </w:rPr>
+        <w:t xml:space="preserve">The system shall allow for the assignment of access roles to </w:t>
+      </w:r>
+      <w:proofErr w:type="gramStart"/>
+      <w:r>
+        <w:rPr>
+          <w:lang w:val="en-US"/>
+        </w:rPr>
+        <w:t>users</w:t>
+      </w:r>
+      <w:proofErr w:type="gramEnd"/>
+    </w:p>
+    <w:p>
+      <w:pPr>
+        <w:rPr>
+          <w:lang w:val="en-US"/>
+        </w:rPr>
+      </w:pPr>
+      <w:r>
+        <w:rPr>
+          <w:lang w:val="en-US"/>
+        </w:rPr>
+        <w:t>Roles:</w:t>
+      </w:r>
+    </w:p>
+    <w:p>
+      <w:pPr>
+        <w:pStyle w:val="ListParagraph"/>
+        <w:numPr>
+          <w:ilvl w:val="0"/>
+          <w:numId w:val="1"/>
+        </w:numPr>
+        <w:rPr>
+          <w:lang w:val="en-US"/>
+        </w:rPr>
+      </w:pPr>
+      <w:r>
+        <w:rPr>
+          <w:lang w:val="en-US"/>
+        </w:rPr>
+        <w:t>Administrator</w:t>
+      </w:r>
+    </w:p>
+    <w:p>
+      <w:pPr>
+        <w:pStyle w:val="ListParagraph"/>
+        <w:numPr>
+          <w:ilvl w:val="0"/>
+          <w:numId w:val="1"/>
+        </w:numPr>
+        <w:rPr>
+          <w:lang w:val="en-US"/>
+        </w:rPr>
+      </w:pPr>
+      <w:r>
+        <w:rPr>
+          <w:lang w:val="en-US"/>
+        </w:rPr>
+        <w:t>Manager</w:t>
+      </w:r>
+    </w:p>
+    <w:p>
+      <w:pPr>
+        <w:pStyle w:val="ListParagraph"/>
+        <w:numPr>
+          <w:ilvl w:val="0"/>
+          <w:numId w:val="1"/>
+        </w:numPr>
+        <w:rPr>
+          <w:lang w:val="en-US"/>
+        </w:rPr>
+      </w:pPr>
+      <w:r>
+        <w:rPr>
+          <w:lang w:val="en-US"/>
+        </w:rPr>
+        <w:t>Field Manager</w:t>
+      </w:r>
+    </w:p>
+    <w:p>
+      <w:pPr>
+        <w:pStyle w:val="ListParagraph"/>
+        <w:numPr>
+          <w:ilvl w:val="0"/>
+          <w:numId w:val="1"/>
+        </w:numPr>
+        <w:rPr>
+          <w:lang w:val="en-US"/>
+        </w:rPr>
+      </w:pPr>
+      <w:r>
+        <w:rPr>
+          <w:lang w:val="en-US"/>
+        </w:rPr>
+        <w:t>Supervisor</w:t>
+      </w:r>
+    </w:p>
+    <w:p>
+      <w:pPr>
+        <w:pStyle w:val="ListParagraph"/>
+        <w:numPr>
+          <w:ilvl w:val="0"/>
+          <w:numId w:val="1"/>
+        </w:numPr>
+        <w:rPr>
+          <w:lang w:val="en-US"/>
+        </w:rPr>
+      </w:pPr>
+      <w:r>
+        <w:rPr>
+          <w:lang w:val="en-US"/>
+        </w:rPr>
+        <w:t>Analyst</w:t>
+      </w:r>
+    </w:p>
+    <w:p>
+      <w:pPr>
+        <w:pStyle w:val="ListParagraph"/>
+        <w:numPr>
+          <w:ilvl w:val="0"/>
+          <w:numId w:val="1"/>
+        </w:numPr>
+        <w:rPr>
+          <w:lang w:val="en-US"/>
+        </w:rPr>
+      </w:pPr>
+      <w:r>
+        <w:rPr>
+          <w:lang w:val="en-US"/>
+        </w:rPr>
+        <w:t>Quality area</w:t>
+      </w:r>
+    </w:p>
+    <w:p>
+      <w:pPr>
+        <w:rPr>
+          <w:lang w:val="en-US"/>
+        </w:rPr>
+      </w:pPr>
+    </w:p>
+    <w:p>
+      <w:pPr>
+        <w:rPr>
+          <w:lang w:val="en-US"/>
+        </w:rPr>
+      </w:pPr>
+    </w:p>
+    <w:p>
+      <w:pPr>
+        <w:rPr>
+          <w:lang w:val="en-US"/>
+        </w:rPr>
+      </w:pPr>
+    </w:p>
+    <w:p>
+      <w:pPr>
+        <w:rPr>
+          <w:lang w:val="en-US"/>
+        </w:rPr>
+      </w:pPr>
+    </w:p>
+    <w:p>
+      <w:pPr>
+        <w:rPr>
+          <w:lang w:val="en-US"/>
+        </w:rPr>
+      </w:pPr>
+    </w:p>
+    <w:p>
+      <w:pPr>
+        <w:rPr>
+          <w:lang w:val="en-US"/>
+        </w:rPr>
+      </w:pPr>
+    </w:p>
+    <w:p>
+      <w:pPr>
+        <w:rPr>
+          <w:lang w:val="en-US"/>
+        </w:rPr>
+      </w:pPr>
+    </w:p>
+    <w:p>
+      <w:pPr>
+        <w:rPr>
+          <w:lang w:val="en-US"/>
+        </w:rPr>
+      </w:pPr>
+    </w:p>
+    <w:p>
+      <w:pPr>
+        <w:rPr>
+          <w:lang w:val="en-US"/>
+        </w:rPr>
+      </w:pPr>
+    </w:p>
+    <w:p>
+      <w:pPr>
+        <w:rPr>
+          <w:lang w:val="en-US"/>
+        </w:rPr>
+      </w:pPr>
+    </w:p>
+    <w:p>
+      <w:pPr>
+        <w:rPr>
+          <w:lang w:val="en-US"/>
+        </w:rPr>
+      </w:pPr>
+    </w:p>
+    <w:p>
+      <w:pPr>
+        <w:rPr>
+          <w:lang w:val="en-US"/>
+        </w:rPr>
+      </w:pPr>
+    </w:p>
+    <w:p>
+      <w:pPr>
+        <w:rPr>
+          <w:lang w:val="en-US"/>
+        </w:rPr>
+      </w:pPr>
+    </w:p>
+    <w:p>
+      <w:pPr>
+        <w:rPr>
+          <w:lang w:val="en-US"/>
+        </w:rPr>
+      </w:pPr>
+    </w:p>
+    <w:p>
+      <w:pPr>
+        <w:rPr>
+          <w:lang w:val="en-US"/>
+        </w:rPr>
+      </w:pPr>
+    </w:p>
+    <w:p>
+      <w:pPr>
+        <w:rPr>
+          <w:lang w:val="en-US"/>
+        </w:rPr>
+      </w:pPr>
+    </w:p>
+    <w:p>
+      <w:pPr>
+        <w:rPr>
+          <w:lang w:val="en-US"/>
+        </w:rPr>
+      </w:pPr>
+    </w:p>
+    <w:p>
+      <w:pPr>
+        <w:rPr>
+          <w:lang w:val="en-US"/>
+        </w:rPr>
+      </w:pPr>
+    </w:p>
+    <w:p>
+      <w:pPr>
+        <w:rPr>
+          <w:lang w:val="en-US"/>
+        </w:rPr>
+      </w:pPr>
+    </w:p>
+    <w:p>
+      <w:pPr>
+        <w:rPr>
+          <w:lang w:val="en-US"/>
+        </w:rPr>
+      </w:pPr>
+    </w:p>
+    <w:p>
+      <w:pPr>
+        <w:rPr>
+          <w:lang w:val="en-US"/>
+        </w:rPr>
+      </w:pPr>
+    </w:p>
+    <w:p>
+      <w:pPr>
+        <w:rPr>
+          <w:lang w:val="en-US"/>
+        </w:rPr>
+      </w:pPr>
+    </w:p>
+    <w:p>
+      <w:pPr>
+        <w:rPr>
+          <w:lang w:val="en-US"/>
+        </w:rPr>
+      </w:pPr>
+    </w:p>
+    <w:p>
+      <w:pPr>
+        <w:rPr>
+          <w:lang w:val="en-US"/>
+        </w:rPr>
+      </w:pPr>
+    </w:p>
+    <w:p>
+      <w:pPr>
+        <w:rPr>
+          <w:lang w:val="en-US"/>
+        </w:rPr>
+      </w:pPr>
+    </w:p>
+    <w:p>
+      <w:pPr>
+        <w:rPr>
+          <w:lang w:val="en-US"/>
+        </w:rPr>
+      </w:pPr>
+    </w:p>
+    <w:p>
+      <w:pPr>
+        <w:rPr>
+          <w:lang w:val="en-US"/>
+        </w:rPr>
+      </w:pPr>
+    </w:p>
+    <w:p>
+      <w:pPr>
+        <w:rPr>
+          <w:lang w:val="en-US"/>
+        </w:rPr>
+      </w:pPr>
+    </w:p>
     <w:p>
       <w:pPr>
         <w:tabs>
           <w:tab w:val="left" w:pos="1200"/>
         </w:tabs>
-      </w:pPr>
-      <w:r>
+        <w:rPr>
+          <w:lang w:val="en-US"/>
+        </w:rPr>
+      </w:pPr>
+      <w:r>
+        <w:rPr>
+          <w:lang w:val="en-US"/>
+        </w:rPr>
         <w:tab/>
       </w:r>
     </w:p>
     <w:sectPr>
-      <w:headerReference w:type="default" r:id="rId6"/>
-      <w:footerReference w:type="default" r:id="rId7"/>
+      <w:headerReference w:type="default" r:id="rId7"/>
+      <w:footerReference w:type="default" r:id="rId8"/>
       <w:pgSz w:w="11906" w:h="16838"/>
       <w:pgMar w:top="1417" w:right="1701" w:bottom="1417" w:left="1701" w:header="708" w:footer="708" w:gutter="0"/>
       <w:cols w:space="708"/>
@@ -352,7 +936,7 @@
         </mc:Choice>
         <mc:Fallback>
           <w:pict>
-            <v:shapetype w14:anchorId="71C738F1" id="_x0000_t120" coordsize="21600,21600" o:spt="120" path="m10800,qx,10800,10800,21600,21600,10800,10800,xe">
+            <v:shapetype w14:anchorId="2CC7CF58" id="_x0000_t120" coordsize="21600,21600" o:spt="120" path="m10800,qx,10800,10800,21600,21600,10800,10800,xe">
               <v:path gradientshapeok="t" o:connecttype="custom" o:connectlocs="10800,0;3163,3163;0,10800;3163,18437;10800,21600;18437,18437;21600,10800;18437,3163" textboxrect="3163,3163,18437,18437"/>
             </v:shapetype>
             <v:shape id="Flowchart: Connector 2" o:spid="_x0000_s1026" type="#_x0000_t120" style="position:absolute;margin-left:3.7pt;margin-top:-25.8pt;width:54.9pt;height:54.9pt;z-index:251659264;visibility:visible;mso-wrap-style:square;mso-width-percent:0;mso-height-percent:0;mso-wrap-distance-left:9pt;mso-wrap-distance-top:0;mso-wrap-distance-right:9pt;mso-wrap-distance-bottom:0;mso-position-horizontal:right;mso-position-horizontal-relative:left-margin-area;mso-position-vertical:absolute;mso-position-vertical-relative:text;mso-width-percent:0;mso-height-percent:0;mso-width-relative:margin;mso-height-relative:margin;v-text-anchor:middle" o:gfxdata="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" stroked="f" strokeweight="1pt">
@@ -403,6 +987,127 @@
     </w:pPr>
   </w:p>
 </w:hdr>
+</file>
+
+<file path=word/numbering.xml><?xml version="1.0" encoding="utf-8"?>
+<w:numbering xmlns:wpc="http://schemas.microsoft.com/office/word/2010/wordprocessingCanvas" xmlns:cx="http://schemas.microsoft.com/office/drawing/2014/chartex" xmlns:cx1="http://schemas.microsoft.com/office/drawing/2015/9/8/chartex" xmlns:cx2="http://schemas.microsoft.com/office/drawing/2015/10/21/chartex" xmlns:cx3="http://schemas.microsoft.com/office/drawing/2016/5/9/chartex" xmlns:cx4="http://schemas.microsoft.com/office/drawing/2016/5/10/chartex" xmlns:cx5="http://schemas.microsoft.com/office/drawing/2016/5/11/chartex" xmlns:cx6="http://schemas.microsoft.com/office/drawing/2016/5/12/chartex" xmlns:cx7="http://schemas.microsoft.com/office/drawing/2016/5/13/chartex" xmlns:cx8="http://schemas.microsoft.com/office/drawing/2016/5/14/chartex" xmlns:mc="http://schemas.openxmlformats.org/markup-compatibility/2006" xmlns:aink="http://schemas.microsoft.com/office/drawing/2016/ink" xmlns:am3d="http://schemas.microsoft.com/office/drawing/2017/model3d" xmlns:o="urn:schemas-microsoft-com:office:office" xmlns:oel="http://schemas.microsoft.com/office/2019/extlst" xmlns:r="http://schemas.openxmlformats.org/officeDocument/2006/relationships" xmlns:m="http://schemas.openxmlformats.org/officeDocument/2006/math" xmlns:v="urn:schemas-microsoft-com:vml" xmlns:wp14="http://schemas.microsoft.com/office/word/2010/wordprocessingDrawing" xmlns:wp="http://schemas.openxmlformats.org/drawingml/2006/wordprocessingDrawing" xmlns:w10="urn:schemas-microsoft-com:office:word" xmlns:w="http://schemas.openxmlformats.org/wordprocessingml/2006/main" xmlns:w14="http://schemas.microsoft.com/office/word/2010/wordml" xmlns:w15="http://schemas.microsoft.com/office/word/2012/wordml" xmlns:w16cex="http://schemas.microsoft.com/office/word/2018/wordml/cex" xmlns:w16cid="http://schemas.microsoft.com/office/word/2016/wordml/cid" xmlns:w16="http://schemas.microsoft.com/office/word/2018/wordml" xmlns:w16du="http://schemas.microsoft.com/office/word/2023/wordml/word16du" xmlns:w16sdtdh="http://schemas.microsoft.com/office/word/2020/wordml/sdtdatahash" xmlns:w16se="http://schemas.microsoft.com/office/word/2015/wordml/symex" xmlns:wpg="http://schemas.microsoft.com/office/word/2010/wordprocessingGroup" xmlns:wpi="http://schemas.microsoft.com/office/word/2010/wordprocessingInk" xmlns:wne="http://schemas.microsoft.com/office/word/2006/wordml" xmlns:wps="http://schemas.microsoft.com/office/word/2010/wordprocessingShape" mc:Ignorable="w14 w15 w16se w16cid w16 w16cex w16sdtdh wp14">
+  <w:abstractNum w:abstractNumId="0" w15:restartNumberingAfterBreak="0">
+    <w:nsid w:val="5FF63E88"/>
+    <w:multiLevelType w:val="hybridMultilevel"/>
+    <w:tmpl w:val="485ED5AA"/>
+    <w:lvl w:ilvl="0" w:tplc="0C0A0001">
+      <w:start w:val="1"/>
+      <w:numFmt w:val="bullet"/>
+      <w:lvlText w:val=""/>
+      <w:lvlJc w:val="left"/>
+      <w:pPr>
+        <w:ind w:left="720" w:hanging="360"/>
+      </w:pPr>
+      <w:rPr>
+        <w:rFonts w:ascii="Symbol" w:hAnsi="Symbol" w:hint="default"/>
+      </w:rPr>
+    </w:lvl>
+    <w:lvl w:ilvl="1" w:tplc="0C0A0003" w:tentative="1">
+      <w:start w:val="1"/>
+      <w:numFmt w:val="bullet"/>
+      <w:lvlText w:val="o"/>
+      <w:lvlJc w:val="left"/>
+      <w:pPr>
+        <w:ind w:left="1440" w:hanging="360"/>
+      </w:pPr>
+      <w:rPr>
+        <w:rFonts w:ascii="Courier New" w:hAnsi="Courier New" w:cs="Courier New" w:hint="default"/>
+      </w:rPr>
+    </w:lvl>
+    <w:lvl w:ilvl="2" w:tplc="0C0A0005" w:tentative="1">
+      <w:start w:val="1"/>
+      <w:numFmt w:val="bullet"/>
+      <w:lvlText w:val=""/>
+      <w:lvlJc w:val="left"/>
+      <w:pPr>
+        <w:ind w:left="2160" w:hanging="360"/>
+      </w:pPr>
+      <w:rPr>
+        <w:rFonts w:ascii="Wingdings" w:hAnsi="Wingdings" w:hint="default"/>
+      </w:rPr>
+    </w:lvl>
+    <w:lvl w:ilvl="3" w:tplc="0C0A0001" w:tentative="1">
+      <w:start w:val="1"/>
+      <w:numFmt w:val="bullet"/>
+      <w:lvlText w:val=""/>
+      <w:lvlJc w:val="left"/>
+      <w:pPr>
+        <w:ind w:left="2880" w:hanging="360"/>
+      </w:pPr>
+      <w:rPr>
+        <w:rFonts w:ascii="Symbol" w:hAnsi="Symbol" w:hint="default"/>
+      </w:rPr>
+    </w:lvl>
+    <w:lvl w:ilvl="4" w:tplc="0C0A0003" w:tentative="1">
+      <w:start w:val="1"/>
+      <w:numFmt w:val="bullet"/>
+      <w:lvlText w:val="o"/>
+      <w:lvlJc w:val="left"/>
+      <w:pPr>
+        <w:ind w:left="3600" w:hanging="360"/>
+      </w:pPr>
+      <w:rPr>
+        <w:rFonts w:ascii="Courier New" w:hAnsi="Courier New" w:cs="Courier New" w:hint="default"/>
+      </w:rPr>
+    </w:lvl>
+    <w:lvl w:ilvl="5" w:tplc="0C0A0005" w:tentative="1">
+      <w:start w:val="1"/>
+      <w:numFmt w:val="bullet"/>
+      <w:lvlText w:val=""/>
+      <w:lvlJc w:val="left"/>
+      <w:pPr>
+        <w:ind w:left="4320" w:hanging="360"/>
+      </w:pPr>
+      <w:rPr>
+        <w:rFonts w:ascii="Wingdings" w:hAnsi="Wingdings" w:hint="default"/>
+      </w:rPr>
+    </w:lvl>
+    <w:lvl w:ilvl="6" w:tplc="0C0A0001" w:tentative="1">
+      <w:start w:val="1"/>
+      <w:numFmt w:val="bullet"/>
+      <w:lvlText w:val=""/>
+      <w:lvlJc w:val="left"/>
+      <w:pPr>
+        <w:ind w:left="5040" w:hanging="360"/>
+      </w:pPr>
+      <w:rPr>
+        <w:rFonts w:ascii="Symbol" w:hAnsi="Symbol" w:hint="default"/>
+      </w:rPr>
+    </w:lvl>
+    <w:lvl w:ilvl="7" w:tplc="0C0A0003" w:tentative="1">
+      <w:start w:val="1"/>
+      <w:numFmt w:val="bullet"/>
+      <w:lvlText w:val="o"/>
+      <w:lvlJc w:val="left"/>
+      <w:pPr>
+        <w:ind w:left="5760" w:hanging="360"/>
+      </w:pPr>
+      <w:rPr>
+        <w:rFonts w:ascii="Courier New" w:hAnsi="Courier New" w:cs="Courier New" w:hint="default"/>
+      </w:rPr>
+    </w:lvl>
+    <w:lvl w:ilvl="8" w:tplc="0C0A0005" w:tentative="1">
+      <w:start w:val="1"/>
+      <w:numFmt w:val="bullet"/>
+      <w:lvlText w:val=""/>
+      <w:lvlJc w:val="left"/>
+      <w:pPr>
+        <w:ind w:left="6480" w:hanging="360"/>
+      </w:pPr>
+      <w:rPr>
+        <w:rFonts w:ascii="Wingdings" w:hAnsi="Wingdings" w:hint="default"/>
+      </w:rPr>
+    </w:lvl>
+  </w:abstractNum>
+  <w:num w:numId="1" w16cid:durableId="837577840">
+    <w:abstractNumId w:val="0"/>
+  </w:num>
+</w:numbering>
 </file>
 
 <file path=word/styles.xml><?xml version="1.0" encoding="utf-8"?>
@@ -805,6 +1510,28 @@
   <w:style w:type="paragraph" w:default="1" w:styleId="Normal">
     <w:name w:val="Normal"/>
     <w:qFormat/>
+    <w:rsid w:val="006A7D2E"/>
+  </w:style>
+  <w:style w:type="paragraph" w:styleId="Heading1">
+    <w:name w:val="heading 1"/>
+    <w:basedOn w:val="Normal"/>
+    <w:next w:val="Normal"/>
+    <w:link w:val="Heading1Char"/>
+    <w:uiPriority w:val="9"/>
+    <w:qFormat/>
+    <w:rsid w:val="00E06E50"/>
+    <w:pPr>
+      <w:keepNext/>
+      <w:keepLines/>
+      <w:spacing w:before="240" w:after="0"/>
+      <w:outlineLvl w:val="0"/>
+    </w:pPr>
+    <w:rPr>
+      <w:rFonts w:asciiTheme="majorHAnsi" w:eastAsiaTheme="majorEastAsia" w:hAnsiTheme="majorHAnsi" w:cstheme="majorBidi"/>
+      <w:color w:val="0F4761" w:themeColor="accent1" w:themeShade="BF"/>
+      <w:sz w:val="32"/>
+      <w:szCs w:val="32"/>
+    </w:rPr>
   </w:style>
   <w:style w:type="character" w:default="1" w:styleId="DefaultParagraphFont">
     <w:name w:val="Default Paragraph Font"/>
@@ -876,6 +1603,30 @@
     <w:link w:val="Footer"/>
     <w:uiPriority w:val="99"/>
     <w:rsid w:val="00D24CC7"/>
+  </w:style>
+  <w:style w:type="character" w:customStyle="1" w:styleId="Heading1Char">
+    <w:name w:val="Heading 1 Char"/>
+    <w:basedOn w:val="DefaultParagraphFont"/>
+    <w:link w:val="Heading1"/>
+    <w:uiPriority w:val="9"/>
+    <w:rsid w:val="00E06E50"/>
+    <w:rPr>
+      <w:rFonts w:asciiTheme="majorHAnsi" w:eastAsiaTheme="majorEastAsia" w:hAnsiTheme="majorHAnsi" w:cstheme="majorBidi"/>
+      <w:color w:val="0F4761" w:themeColor="accent1" w:themeShade="BF"/>
+      <w:sz w:val="32"/>
+      <w:szCs w:val="32"/>
+    </w:rPr>
+  </w:style>
+  <w:style w:type="paragraph" w:styleId="ListParagraph">
+    <w:name w:val="List Paragraph"/>
+    <w:basedOn w:val="Normal"/>
+    <w:uiPriority w:val="34"/>
+    <w:qFormat/>
+    <w:rsid w:val="006A7D2E"/>
+    <w:pPr>
+      <w:ind w:left="720"/>
+      <w:contextualSpacing/>
+    </w:pPr>
   </w:style>
 </w:styles>
 </file>
@@ -953,11 +1704,12 @@
 
 <file path=word/glossary/fontTable.xml><?xml version="1.0" encoding="utf-8"?>
 <w:fonts xmlns:mc="http://schemas.openxmlformats.org/markup-compatibility/2006" xmlns:r="http://schemas.openxmlformats.org/officeDocument/2006/relationships" xmlns:w="http://schemas.openxmlformats.org/wordprocessingml/2006/main" xmlns:w14="http://schemas.microsoft.com/office/word/2010/wordml" xmlns:w15="http://schemas.microsoft.com/office/word/2012/wordml" xmlns:w16cex="http://schemas.microsoft.com/office/word/2018/wordml/cex" xmlns:w16cid="http://schemas.microsoft.com/office/word/2016/wordml/cid" xmlns:w16="http://schemas.microsoft.com/office/word/2018/wordml" xmlns:w16sdtdh="http://schemas.microsoft.com/office/word/2020/wordml/sdtdatahash" xmlns:w16se="http://schemas.microsoft.com/office/word/2015/wordml/symex" mc:Ignorable="w14 w15 w16se w16cid w16 w16cex w16sdtdh">
-  <w:font w:name="Aptos">
-    <w:charset w:val="00"/>
-    <w:family w:val="swiss"/>
+  <w:font w:name="Symbol">
+    <w:panose1 w:val="05050102010706020507"/>
+    <w:charset w:val="02"/>
+    <w:family w:val="roman"/>
     <w:pitch w:val="variable"/>
-    <w:sig w:usb0="20000287" w:usb1="00000003" w:usb2="00000000" w:usb3="00000000" w:csb0="0000019F" w:csb1="00000000"/>
+    <w:sig w:usb0="00000000" w:usb1="10000000" w:usb2="00000000" w:usb3="00000000" w:csb0="80000000" w:csb1="00000000"/>
   </w:font>
   <w:font w:name="Times New Roman">
     <w:panose1 w:val="02020603050405020304"/>
@@ -966,18 +1718,38 @@
     <w:pitch w:val="variable"/>
     <w:sig w:usb0="E0002EFF" w:usb1="C000785B" w:usb2="00000009" w:usb3="00000000" w:csb0="000001FF" w:csb1="00000000"/>
   </w:font>
+  <w:font w:name="Courier New">
+    <w:panose1 w:val="02070309020205020404"/>
+    <w:charset w:val="00"/>
+    <w:family w:val="modern"/>
+    <w:pitch w:val="fixed"/>
+    <w:sig w:usb0="E0002EFF" w:usb1="C0007843" w:usb2="00000009" w:usb3="00000000" w:csb0="000001FF" w:csb1="00000000"/>
+  </w:font>
+  <w:font w:name="Wingdings">
+    <w:panose1 w:val="05000000000000000000"/>
+    <w:charset w:val="02"/>
+    <w:family w:val="auto"/>
+    <w:pitch w:val="variable"/>
+    <w:sig w:usb0="00000000" w:usb1="10000000" w:usb2="00000000" w:usb3="00000000" w:csb0="80000000" w:csb1="00000000"/>
+  </w:font>
+  <w:font w:name="Aptos">
+    <w:charset w:val="00"/>
+    <w:family w:val="swiss"/>
+    <w:pitch w:val="variable"/>
+    <w:sig w:usb0="20000287" w:usb1="00000003" w:usb2="00000000" w:usb3="00000000" w:csb0="0000019F" w:csb1="00000000"/>
+  </w:font>
+  <w:font w:name="Aptos Display">
+    <w:charset w:val="00"/>
+    <w:family w:val="swiss"/>
+    <w:pitch w:val="variable"/>
+    <w:sig w:usb0="20000287" w:usb1="00000003" w:usb2="00000000" w:usb3="00000000" w:csb0="0000019F" w:csb1="00000000"/>
+  </w:font>
   <w:font w:name="Algerian">
     <w:panose1 w:val="04020705040A02060702"/>
     <w:charset w:val="00"/>
     <w:family w:val="decorative"/>
     <w:pitch w:val="variable"/>
     <w:sig w:usb0="00000003" w:usb1="00000000" w:usb2="00000000" w:usb3="00000000" w:csb0="00000001" w:csb1="00000000"/>
-  </w:font>
-  <w:font w:name="Aptos Display">
-    <w:charset w:val="00"/>
-    <w:family w:val="swiss"/>
-    <w:pitch w:val="variable"/>
-    <w:sig w:usb0="20000287" w:usb1="00000003" w:usb2="00000000" w:usb3="00000000" w:csb0="0000019F" w:csb1="00000000"/>
   </w:font>
   <w:font w:name="Calibri">
     <w:panose1 w:val="020F0502020204030204"/>
@@ -1014,7 +1786,7 @@
   <w:rsids>
     <w:rsidRoot w:val="003872FF"/>
     <w:rsid w:val="003872FF"/>
-    <w:rsid w:val="00DE56F0"/>
+    <w:rsid w:val="00A01DCB"/>
   </w:rsids>
   <m:mathPr>
     <m:mathFont m:val="Cambria Math"/>

</xml_diff>

<commit_message>
add two functionalRequeriments: Farm management Plot management
</commit_message>
<xml_diff>
--- a/01-Documentation/03-FunctionalRequeriments/FunctionalRequeriments.docx
+++ b/01-Documentation/03-FunctionalRequeriments/FunctionalRequeriments.docx
@@ -18,36 +18,8 @@
           <w:color w:val="47D459" w:themeColor="accent3" w:themeTint="99"/>
           <w:lang w:val="en-US"/>
         </w:rPr>
-        <w:t xml:space="preserve">Functional </w:t>
-      </w:r>
-      <w:proofErr w:type="spellStart"/>
-      <w:r>
-        <w:rPr>
-          <w:rFonts w:ascii="Algerian" w:hAnsi="Algerian"/>
-          <w:color w:val="47D459" w:themeColor="accent3" w:themeTint="99"/>
-          <w:lang w:val="en-US"/>
-        </w:rPr>
-        <w:t>requeriments</w:t>
-      </w:r>
-      <w:proofErr w:type="spellEnd"/>
-      <w:r>
-        <w:rPr>
-          <w:rFonts w:ascii="Algerian" w:hAnsi="Algerian"/>
-          <w:color w:val="47D459" w:themeColor="accent3" w:themeTint="99"/>
-          <w:lang w:val="en-US"/>
-        </w:rPr>
-        <w:t xml:space="preserve"> – </w:t>
-      </w:r>
-      <w:proofErr w:type="spellStart"/>
-      <w:r>
-        <w:rPr>
-          <w:rFonts w:ascii="Algerian" w:hAnsi="Algerian"/>
-          <w:color w:val="47D459" w:themeColor="accent3" w:themeTint="99"/>
-          <w:lang w:val="en-US"/>
-        </w:rPr>
-        <w:t>AgroBrain</w:t>
-      </w:r>
-      <w:proofErr w:type="spellEnd"/>
+        <w:t>Functional requeriments – AgroBrain</w:t>
+      </w:r>
     </w:p>
     <w:p>
       <w:pPr>
@@ -114,7 +86,7 @@
           </mc:Choice>
           <mc:Fallback>
             <w:pict>
-              <v:line w14:anchorId="399ADE57" id="Straight Connector 1" o:spid="_x0000_s1026" style="position:absolute;z-index:251659264;visibility:visible;mso-wrap-style:square;mso-wrap-distance-left:9pt;mso-wrap-distance-top:0;mso-wrap-distance-right:9pt;mso-wrap-distance-bottom:0;mso-position-horizontal:absolute;mso-position-horizontal-relative:text;mso-position-vertical:absolute;mso-position-vertical-relative:text" from="175.35pt,20.4pt" to="475.35pt,20.4pt" o:gfxdata="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" strokecolor="#156082 [3204]" strokeweight="1.5pt">
+              <v:line w14:anchorId="06AE3041" id="Straight Connector 1" o:spid="_x0000_s1026" style="position:absolute;z-index:251659264;visibility:visible;mso-wrap-style:square;mso-wrap-distance-left:9pt;mso-wrap-distance-top:0;mso-wrap-distance-right:9pt;mso-wrap-distance-bottom:0;mso-position-horizontal:absolute;mso-position-horizontal-relative:text;mso-position-vertical:absolute;mso-position-vertical-relative:text" from="175.35pt,20.4pt" to="475.35pt,20.4pt" o:gfxdata="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" strokecolor="#156082 [3204]" strokeweight="1.5pt">
                 <v:stroke joinstyle="miter"/>
               </v:line>
             </w:pict>
@@ -151,16 +123,8 @@
         <w:rPr>
           <w:lang w:val="en-US"/>
         </w:rPr>
-        <w:t xml:space="preserve">The System shall allow the registration, modification, querying, and deactivation of </w:t>
-      </w:r>
-      <w:proofErr w:type="gramStart"/>
-      <w:r>
-        <w:rPr>
-          <w:lang w:val="en-US"/>
-        </w:rPr>
-        <w:t>users</w:t>
-      </w:r>
-      <w:proofErr w:type="gramEnd"/>
+        <w:t>The System shall allow the registration, modification, querying, and deactivation of users</w:t>
+      </w:r>
     </w:p>
     <w:p>
       <w:pPr>
@@ -227,7 +191,7 @@
           </mc:Choice>
           <mc:Fallback>
             <w:pict>
-              <v:line w14:anchorId="109CC519" id="Straight Connector 1" o:spid="_x0000_s1026" style="position:absolute;z-index:251661312;visibility:visible;mso-wrap-style:square;mso-wrap-distance-left:9pt;mso-wrap-distance-top:0;mso-wrap-distance-right:9pt;mso-wrap-distance-bottom:0;mso-position-horizontal:absolute;mso-position-horizontal-relative:text;mso-position-vertical:absolute;mso-position-vertical-relative:text" from="175.35pt,20.4pt" to="475.35pt,20.4pt" o:gfxdata="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" strokecolor="#156082 [3204]" strokeweight="1.5pt">
+              <v:line w14:anchorId="3B8F9913" id="Straight Connector 1" o:spid="_x0000_s1026" style="position:absolute;z-index:251661312;visibility:visible;mso-wrap-style:square;mso-wrap-distance-left:9pt;mso-wrap-distance-top:0;mso-wrap-distance-right:9pt;mso-wrap-distance-bottom:0;mso-position-horizontal:absolute;mso-position-horizontal-relative:text;mso-position-vertical:absolute;mso-position-vertical-relative:text" from="175.35pt,20.4pt" to="475.35pt,20.4pt" o:gfxdata="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" strokecolor="#156082 [3204]" strokeweight="1.5pt">
                 <v:stroke joinstyle="miter"/>
               </v:line>
             </w:pict>
@@ -282,16 +246,8 @@
         <w:rPr>
           <w:lang w:val="en-US"/>
         </w:rPr>
-        <w:t xml:space="preserve">The system shall allow for the assignment of access roles to </w:t>
-      </w:r>
-      <w:proofErr w:type="gramStart"/>
-      <w:r>
-        <w:rPr>
-          <w:lang w:val="en-US"/>
-        </w:rPr>
-        <w:t>users</w:t>
-      </w:r>
-      <w:proofErr w:type="gramEnd"/>
+        <w:t>The system shall allow for the assignment of access roles to users</w:t>
+      </w:r>
     </w:p>
     <w:p>
       <w:pPr>
@@ -416,10 +372,211 @@
     </w:p>
     <w:p>
       <w:pPr>
-        <w:rPr>
-          <w:lang w:val="en-US"/>
-        </w:rPr>
-      </w:pPr>
+        <w:pStyle w:val="Heading1"/>
+        <w:rPr>
+          <w:lang w:val="en-US"/>
+        </w:rPr>
+      </w:pPr>
+      <w:r>
+        <w:rPr>
+          <w:noProof/>
+          <w:lang w:val="en-US"/>
+        </w:rPr>
+        <mc:AlternateContent>
+          <mc:Choice Requires="wps">
+            <w:drawing>
+              <wp:anchor distT="0" distB="0" distL="114300" distR="114300" simplePos="0" relativeHeight="251663360" behindDoc="0" locked="0" layoutInCell="1" allowOverlap="1" wp14:anchorId="131541BC" wp14:editId="31877AFA">
+                <wp:simplePos x="0" y="0"/>
+                <wp:positionH relativeFrom="column">
+                  <wp:posOffset>2226945</wp:posOffset>
+                </wp:positionH>
+                <wp:positionV relativeFrom="paragraph">
+                  <wp:posOffset>259080</wp:posOffset>
+                </wp:positionV>
+                <wp:extent cx="3810000" cy="0"/>
+                <wp:effectExtent l="0" t="0" r="0" b="0"/>
+                <wp:wrapNone/>
+                <wp:docPr id="206984766" name="Straight Connector 1"/>
+                <wp:cNvGraphicFramePr/>
+                <a:graphic xmlns:a="http://schemas.openxmlformats.org/drawingml/2006/main">
+                  <a:graphicData uri="http://schemas.microsoft.com/office/word/2010/wordprocessingShape">
+                    <wps:wsp>
+                      <wps:cNvCnPr/>
+                      <wps:spPr>
+                        <a:xfrm>
+                          <a:off x="0" y="0"/>
+                          <a:ext cx="3810000" cy="0"/>
+                        </a:xfrm>
+                        <a:prstGeom prst="line">
+                          <a:avLst/>
+                        </a:prstGeom>
+                        <a:ln w="19050"/>
+                      </wps:spPr>
+                      <wps:style>
+                        <a:lnRef idx="2">
+                          <a:schemeClr val="accent1"/>
+                        </a:lnRef>
+                        <a:fillRef idx="0">
+                          <a:schemeClr val="accent1"/>
+                        </a:fillRef>
+                        <a:effectRef idx="1">
+                          <a:schemeClr val="accent1"/>
+                        </a:effectRef>
+                        <a:fontRef idx="minor">
+                          <a:schemeClr val="tx1"/>
+                        </a:fontRef>
+                      </wps:style>
+                      <wps:bodyPr/>
+                    </wps:wsp>
+                  </a:graphicData>
+                </a:graphic>
+              </wp:anchor>
+            </w:drawing>
+          </mc:Choice>
+          <mc:Fallback>
+            <w:pict>
+              <v:line w14:anchorId="37F44DED" id="Straight Connector 1" o:spid="_x0000_s1026" style="position:absolute;z-index:251663360;visibility:visible;mso-wrap-style:square;mso-wrap-distance-left:9pt;mso-wrap-distance-top:0;mso-wrap-distance-right:9pt;mso-wrap-distance-bottom:0;mso-position-horizontal:absolute;mso-position-horizontal-relative:text;mso-position-vertical:absolute;mso-position-vertical-relative:text" from="175.35pt,20.4pt" to="475.35pt,20.4pt" o:gfxdata="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" strokecolor="#156082 [3204]" strokeweight="1.5pt">
+                <v:stroke joinstyle="miter"/>
+              </v:line>
+            </w:pict>
+          </mc:Fallback>
+        </mc:AlternateContent>
+      </w:r>
+      <w:r>
+        <w:rPr>
+          <w:lang w:val="en-US"/>
+        </w:rPr>
+        <w:t>RF-00</w:t>
+      </w:r>
+      <w:r>
+        <w:rPr>
+          <w:lang w:val="en-US"/>
+        </w:rPr>
+        <w:t>3 Farm Management</w:t>
+      </w:r>
+    </w:p>
+    <w:p>
+      <w:pPr>
+        <w:rPr>
+          <w:lang w:val="en-US"/>
+        </w:rPr>
+      </w:pPr>
+      <w:r>
+        <w:rPr>
+          <w:lang w:val="en-US"/>
+        </w:rPr>
+        <w:t>The system shall allow for the registration and management of agricultural farms.</w:t>
+      </w:r>
+    </w:p>
+    <w:p>
+      <w:pPr>
+        <w:pStyle w:val="Heading1"/>
+        <w:rPr>
+          <w:lang w:val="en-US"/>
+        </w:rPr>
+      </w:pPr>
+      <w:r>
+        <w:rPr>
+          <w:noProof/>
+          <w:lang w:val="en-US"/>
+        </w:rPr>
+        <mc:AlternateContent>
+          <mc:Choice Requires="wps">
+            <w:drawing>
+              <wp:anchor distT="0" distB="0" distL="114300" distR="114300" simplePos="0" relativeHeight="251665408" behindDoc="0" locked="0" layoutInCell="1" allowOverlap="1" wp14:anchorId="633064E7" wp14:editId="529BED2D">
+                <wp:simplePos x="0" y="0"/>
+                <wp:positionH relativeFrom="column">
+                  <wp:posOffset>2226945</wp:posOffset>
+                </wp:positionH>
+                <wp:positionV relativeFrom="paragraph">
+                  <wp:posOffset>259080</wp:posOffset>
+                </wp:positionV>
+                <wp:extent cx="3810000" cy="0"/>
+                <wp:effectExtent l="0" t="0" r="0" b="0"/>
+                <wp:wrapNone/>
+                <wp:docPr id="793085851" name="Straight Connector 1"/>
+                <wp:cNvGraphicFramePr/>
+                <a:graphic xmlns:a="http://schemas.openxmlformats.org/drawingml/2006/main">
+                  <a:graphicData uri="http://schemas.microsoft.com/office/word/2010/wordprocessingShape">
+                    <wps:wsp>
+                      <wps:cNvCnPr/>
+                      <wps:spPr>
+                        <a:xfrm>
+                          <a:off x="0" y="0"/>
+                          <a:ext cx="3810000" cy="0"/>
+                        </a:xfrm>
+                        <a:prstGeom prst="line">
+                          <a:avLst/>
+                        </a:prstGeom>
+                        <a:ln w="19050"/>
+                      </wps:spPr>
+                      <wps:style>
+                        <a:lnRef idx="2">
+                          <a:schemeClr val="accent1"/>
+                        </a:lnRef>
+                        <a:fillRef idx="0">
+                          <a:schemeClr val="accent1"/>
+                        </a:fillRef>
+                        <a:effectRef idx="1">
+                          <a:schemeClr val="accent1"/>
+                        </a:effectRef>
+                        <a:fontRef idx="minor">
+                          <a:schemeClr val="tx1"/>
+                        </a:fontRef>
+                      </wps:style>
+                      <wps:bodyPr/>
+                    </wps:wsp>
+                  </a:graphicData>
+                </a:graphic>
+              </wp:anchor>
+            </w:drawing>
+          </mc:Choice>
+          <mc:Fallback>
+            <w:pict>
+              <v:line w14:anchorId="2E668E85" id="Straight Connector 1" o:spid="_x0000_s1026" style="position:absolute;z-index:251665408;visibility:visible;mso-wrap-style:square;mso-wrap-distance-left:9pt;mso-wrap-distance-top:0;mso-wrap-distance-right:9pt;mso-wrap-distance-bottom:0;mso-position-horizontal:absolute;mso-position-horizontal-relative:text;mso-position-vertical:absolute;mso-position-vertical-relative:text" from="175.35pt,20.4pt" to="475.35pt,20.4pt" o:gfxdata="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" strokecolor="#156082 [3204]" strokeweight="1.5pt">
+                <v:stroke joinstyle="miter"/>
+              </v:line>
+            </w:pict>
+          </mc:Fallback>
+        </mc:AlternateContent>
+      </w:r>
+      <w:r>
+        <w:rPr>
+          <w:lang w:val="en-US"/>
+        </w:rPr>
+        <w:t>RF-00</w:t>
+      </w:r>
+      <w:r>
+        <w:rPr>
+          <w:lang w:val="en-US"/>
+        </w:rPr>
+        <w:t>4</w:t>
+      </w:r>
+      <w:r>
+        <w:rPr>
+          <w:lang w:val="en-US"/>
+        </w:rPr>
+        <w:t xml:space="preserve"> </w:t>
+      </w:r>
+      <w:r>
+        <w:rPr>
+          <w:lang w:val="en-US"/>
+        </w:rPr>
+        <w:t>Plot Management</w:t>
+      </w:r>
+    </w:p>
+    <w:p>
+      <w:pPr>
+        <w:rPr>
+          <w:lang w:val="en-US"/>
+        </w:rPr>
+      </w:pPr>
+      <w:r>
+        <w:rPr>
+          <w:lang w:val="en-US"/>
+        </w:rPr>
+        <w:t>The system shall allow for the registration of plots associated with a farm</w:t>
+      </w:r>
     </w:p>
     <w:p>
       <w:pPr>
@@ -936,7 +1093,7 @@
         </mc:Choice>
         <mc:Fallback>
           <w:pict>
-            <v:shapetype w14:anchorId="2CC7CF58" id="_x0000_t120" coordsize="21600,21600" o:spt="120" path="m10800,qx,10800,10800,21600,21600,10800,10800,xe">
+            <v:shapetype w14:anchorId="641FE46C" id="_x0000_t120" coordsize="21600,21600" o:spt="120" path="m10800,qx,10800,10800,21600,21600,10800,10800,xe">
               <v:path gradientshapeok="t" o:connecttype="custom" o:connectlocs="10800,0;3163,3163;0,10800;3163,18437;10800,21600;18437,18437;21600,10800;18437,3163" textboxrect="3163,3163,18437,18437"/>
             </v:shapetype>
             <v:shape id="Flowchart: Connector 2" o:spid="_x0000_s1026" type="#_x0000_t120" style="position:absolute;margin-left:3.7pt;margin-top:-25.8pt;width:54.9pt;height:54.9pt;z-index:251659264;visibility:visible;mso-wrap-style:square;mso-width-percent:0;mso-height-percent:0;mso-wrap-distance-left:9pt;mso-wrap-distance-top:0;mso-wrap-distance-right:9pt;mso-wrap-distance-bottom:0;mso-position-horizontal:right;mso-position-horizontal-relative:left-margin-area;mso-position-vertical:absolute;mso-position-vertical-relative:text;mso-width-percent:0;mso-height-percent:0;mso-width-relative:margin;mso-height-relative:margin;v-text-anchor:middle" o:gfxdata="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" stroked="f" strokeweight="1pt">
@@ -1786,7 +1943,7 @@
   <w:rsids>
     <w:rsidRoot w:val="003872FF"/>
     <w:rsid w:val="003872FF"/>
-    <w:rsid w:val="00A01DCB"/>
+    <w:rsid w:val="005F39AF"/>
   </w:rsids>
   <m:mathPr>
     <m:mathFont m:val="Cambria Math"/>

</xml_diff>

<commit_message>
add two functional requeriments: Worker management Crew management
</commit_message>
<xml_diff>
--- a/01-Documentation/03-FunctionalRequeriments/FunctionalRequeriments.docx
+++ b/01-Documentation/03-FunctionalRequeriments/FunctionalRequeriments.docx
@@ -86,7 +86,7 @@
           </mc:Choice>
           <mc:Fallback>
             <w:pict>
-              <v:line w14:anchorId="06AE3041" id="Straight Connector 1" o:spid="_x0000_s1026" style="position:absolute;z-index:251659264;visibility:visible;mso-wrap-style:square;mso-wrap-distance-left:9pt;mso-wrap-distance-top:0;mso-wrap-distance-right:9pt;mso-wrap-distance-bottom:0;mso-position-horizontal:absolute;mso-position-horizontal-relative:text;mso-position-vertical:absolute;mso-position-vertical-relative:text" from="175.35pt,20.4pt" to="475.35pt,20.4pt" o:gfxdata="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" strokecolor="#156082 [3204]" strokeweight="1.5pt">
+              <v:line w14:anchorId="7182C736" id="Straight Connector 1" o:spid="_x0000_s1026" style="position:absolute;z-index:251659264;visibility:visible;mso-wrap-style:square;mso-wrap-distance-left:9pt;mso-wrap-distance-top:0;mso-wrap-distance-right:9pt;mso-wrap-distance-bottom:0;mso-position-horizontal:absolute;mso-position-horizontal-relative:text;mso-position-vertical:absolute;mso-position-vertical-relative:text" from="175.35pt,20.4pt" to="475.35pt,20.4pt" o:gfxdata="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" strokecolor="#156082 [3204]" strokeweight="1.5pt">
                 <v:stroke joinstyle="miter"/>
               </v:line>
             </w:pict>
@@ -191,7 +191,7 @@
           </mc:Choice>
           <mc:Fallback>
             <w:pict>
-              <v:line w14:anchorId="3B8F9913" id="Straight Connector 1" o:spid="_x0000_s1026" style="position:absolute;z-index:251661312;visibility:visible;mso-wrap-style:square;mso-wrap-distance-left:9pt;mso-wrap-distance-top:0;mso-wrap-distance-right:9pt;mso-wrap-distance-bottom:0;mso-position-horizontal:absolute;mso-position-horizontal-relative:text;mso-position-vertical:absolute;mso-position-vertical-relative:text" from="175.35pt,20.4pt" to="475.35pt,20.4pt" o:gfxdata="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" strokecolor="#156082 [3204]" strokeweight="1.5pt">
+              <v:line w14:anchorId="49C1D46E" id="Straight Connector 1" o:spid="_x0000_s1026" style="position:absolute;z-index:251661312;visibility:visible;mso-wrap-style:square;mso-wrap-distance-left:9pt;mso-wrap-distance-top:0;mso-wrap-distance-right:9pt;mso-wrap-distance-bottom:0;mso-position-horizontal:absolute;mso-position-horizontal-relative:text;mso-position-vertical:absolute;mso-position-vertical-relative:text" from="175.35pt,20.4pt" to="475.35pt,20.4pt" o:gfxdata="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" strokecolor="#156082 [3204]" strokeweight="1.5pt">
                 <v:stroke joinstyle="miter"/>
               </v:line>
             </w:pict>
@@ -435,7 +435,7 @@
           </mc:Choice>
           <mc:Fallback>
             <w:pict>
-              <v:line w14:anchorId="37F44DED" id="Straight Connector 1" o:spid="_x0000_s1026" style="position:absolute;z-index:251663360;visibility:visible;mso-wrap-style:square;mso-wrap-distance-left:9pt;mso-wrap-distance-top:0;mso-wrap-distance-right:9pt;mso-wrap-distance-bottom:0;mso-position-horizontal:absolute;mso-position-horizontal-relative:text;mso-position-vertical:absolute;mso-position-vertical-relative:text" from="175.35pt,20.4pt" to="475.35pt,20.4pt" o:gfxdata="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" strokecolor="#156082 [3204]" strokeweight="1.5pt">
+              <v:line w14:anchorId="42274885" id="Straight Connector 1" o:spid="_x0000_s1026" style="position:absolute;z-index:251663360;visibility:visible;mso-wrap-style:square;mso-wrap-distance-left:9pt;mso-wrap-distance-top:0;mso-wrap-distance-right:9pt;mso-wrap-distance-bottom:0;mso-position-horizontal:absolute;mso-position-horizontal-relative:text;mso-position-vertical:absolute;mso-position-vertical-relative:text" from="175.35pt,20.4pt" to="475.35pt,20.4pt" o:gfxdata="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" strokecolor="#156082 [3204]" strokeweight="1.5pt">
                 <v:stroke joinstyle="miter"/>
               </v:line>
             </w:pict>
@@ -533,7 +533,7 @@
           </mc:Choice>
           <mc:Fallback>
             <w:pict>
-              <v:line w14:anchorId="2E668E85" id="Straight Connector 1" o:spid="_x0000_s1026" style="position:absolute;z-index:251665408;visibility:visible;mso-wrap-style:square;mso-wrap-distance-left:9pt;mso-wrap-distance-top:0;mso-wrap-distance-right:9pt;mso-wrap-distance-bottom:0;mso-position-horizontal:absolute;mso-position-horizontal-relative:text;mso-position-vertical:absolute;mso-position-vertical-relative:text" from="175.35pt,20.4pt" to="475.35pt,20.4pt" o:gfxdata="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" strokecolor="#156082 [3204]" strokeweight="1.5pt">
+              <v:line w14:anchorId="318F933B" id="Straight Connector 1" o:spid="_x0000_s1026" style="position:absolute;z-index:251665408;visibility:visible;mso-wrap-style:square;mso-wrap-distance-left:9pt;mso-wrap-distance-top:0;mso-wrap-distance-right:9pt;mso-wrap-distance-bottom:0;mso-position-horizontal:absolute;mso-position-horizontal-relative:text;mso-position-vertical:absolute;mso-position-vertical-relative:text" from="175.35pt,20.4pt" to="475.35pt,20.4pt" o:gfxdata="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" strokecolor="#156082 [3204]" strokeweight="1.5pt">
                 <v:stroke joinstyle="miter"/>
               </v:line>
             </w:pict>
@@ -580,45 +580,235 @@
     </w:p>
     <w:p>
       <w:pPr>
-        <w:rPr>
-          <w:lang w:val="en-US"/>
-        </w:rPr>
-      </w:pPr>
-    </w:p>
-    <w:p>
-      <w:pPr>
-        <w:rPr>
-          <w:lang w:val="en-US"/>
-        </w:rPr>
-      </w:pPr>
-    </w:p>
-    <w:p>
-      <w:pPr>
-        <w:rPr>
-          <w:lang w:val="en-US"/>
-        </w:rPr>
-      </w:pPr>
-    </w:p>
-    <w:p>
-      <w:pPr>
-        <w:rPr>
-          <w:lang w:val="en-US"/>
-        </w:rPr>
-      </w:pPr>
-    </w:p>
-    <w:p>
-      <w:pPr>
-        <w:rPr>
-          <w:lang w:val="en-US"/>
-        </w:rPr>
-      </w:pPr>
-    </w:p>
-    <w:p>
-      <w:pPr>
-        <w:rPr>
-          <w:lang w:val="en-US"/>
-        </w:rPr>
-      </w:pPr>
+        <w:pStyle w:val="Heading1"/>
+        <w:rPr>
+          <w:lang w:val="en-US"/>
+        </w:rPr>
+      </w:pPr>
+      <w:r>
+        <w:rPr>
+          <w:noProof/>
+          <w:lang w:val="en-US"/>
+        </w:rPr>
+        <mc:AlternateContent>
+          <mc:Choice Requires="wps">
+            <w:drawing>
+              <wp:anchor distT="0" distB="0" distL="114300" distR="114300" simplePos="0" relativeHeight="251667456" behindDoc="0" locked="0" layoutInCell="1" allowOverlap="1" wp14:anchorId="6F8945E1" wp14:editId="141440CB">
+                <wp:simplePos x="0" y="0"/>
+                <wp:positionH relativeFrom="column">
+                  <wp:posOffset>2425065</wp:posOffset>
+                </wp:positionH>
+                <wp:positionV relativeFrom="paragraph">
+                  <wp:posOffset>257810</wp:posOffset>
+                </wp:positionV>
+                <wp:extent cx="3611880" cy="0"/>
+                <wp:effectExtent l="0" t="0" r="0" b="0"/>
+                <wp:wrapNone/>
+                <wp:docPr id="2086814722" name="Straight Connector 1"/>
+                <wp:cNvGraphicFramePr/>
+                <a:graphic xmlns:a="http://schemas.openxmlformats.org/drawingml/2006/main">
+                  <a:graphicData uri="http://schemas.microsoft.com/office/word/2010/wordprocessingShape">
+                    <wps:wsp>
+                      <wps:cNvCnPr/>
+                      <wps:spPr>
+                        <a:xfrm>
+                          <a:off x="0" y="0"/>
+                          <a:ext cx="3611880" cy="0"/>
+                        </a:xfrm>
+                        <a:prstGeom prst="line">
+                          <a:avLst/>
+                        </a:prstGeom>
+                        <a:ln w="19050"/>
+                      </wps:spPr>
+                      <wps:style>
+                        <a:lnRef idx="2">
+                          <a:schemeClr val="accent1"/>
+                        </a:lnRef>
+                        <a:fillRef idx="0">
+                          <a:schemeClr val="accent1"/>
+                        </a:fillRef>
+                        <a:effectRef idx="1">
+                          <a:schemeClr val="accent1"/>
+                        </a:effectRef>
+                        <a:fontRef idx="minor">
+                          <a:schemeClr val="tx1"/>
+                        </a:fontRef>
+                      </wps:style>
+                      <wps:bodyPr/>
+                    </wps:wsp>
+                  </a:graphicData>
+                </a:graphic>
+                <wp14:sizeRelH relativeFrom="margin">
+                  <wp14:pctWidth>0</wp14:pctWidth>
+                </wp14:sizeRelH>
+              </wp:anchor>
+            </w:drawing>
+          </mc:Choice>
+          <mc:Fallback>
+            <w:pict>
+              <v:line w14:anchorId="421AB133" id="Straight Connector 1" o:spid="_x0000_s1026" style="position:absolute;z-index:251667456;visibility:visible;mso-wrap-style:square;mso-width-percent:0;mso-wrap-distance-left:9pt;mso-wrap-distance-top:0;mso-wrap-distance-right:9pt;mso-wrap-distance-bottom:0;mso-position-horizontal:absolute;mso-position-horizontal-relative:text;mso-position-vertical:absolute;mso-position-vertical-relative:text;mso-width-percent:0;mso-width-relative:margin" from="190.95pt,20.3pt" to="475.35pt,20.3pt" o:gfxdata="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" strokecolor="#156082 [3204]" strokeweight="1.5pt">
+                <v:stroke joinstyle="miter"/>
+              </v:line>
+            </w:pict>
+          </mc:Fallback>
+        </mc:AlternateContent>
+      </w:r>
+      <w:r>
+        <w:rPr>
+          <w:lang w:val="en-US"/>
+        </w:rPr>
+        <w:t>RF-00</w:t>
+      </w:r>
+      <w:r>
+        <w:rPr>
+          <w:lang w:val="en-US"/>
+        </w:rPr>
+        <w:t>5</w:t>
+      </w:r>
+      <w:r>
+        <w:rPr>
+          <w:lang w:val="en-US"/>
+        </w:rPr>
+        <w:t xml:space="preserve"> </w:t>
+      </w:r>
+      <w:r>
+        <w:rPr>
+          <w:lang w:val="en-US"/>
+        </w:rPr>
+        <w:t>Worker Management</w:t>
+      </w:r>
+    </w:p>
+    <w:p>
+      <w:pPr>
+        <w:rPr>
+          <w:lang w:val="en-US"/>
+        </w:rPr>
+      </w:pPr>
+      <w:r>
+        <w:rPr>
+          <w:lang w:val="en-US"/>
+        </w:rPr>
+        <w:t>The system Shall for the registration of workers and their association with crew</w:t>
+      </w:r>
+      <w:r>
+        <w:rPr>
+          <w:lang w:val="en-US"/>
+        </w:rPr>
+        <w:t>s</w:t>
+      </w:r>
+    </w:p>
+    <w:p>
+      <w:pPr>
+        <w:pStyle w:val="Heading1"/>
+        <w:rPr>
+          <w:lang w:val="en-US"/>
+        </w:rPr>
+      </w:pPr>
+      <w:r>
+        <w:rPr>
+          <w:noProof/>
+          <w:lang w:val="en-US"/>
+        </w:rPr>
+        <mc:AlternateContent>
+          <mc:Choice Requires="wps">
+            <w:drawing>
+              <wp:anchor distT="0" distB="0" distL="114300" distR="114300" simplePos="0" relativeHeight="251669504" behindDoc="0" locked="0" layoutInCell="1" allowOverlap="1" wp14:anchorId="7B08EE91" wp14:editId="20B52318">
+                <wp:simplePos x="0" y="0"/>
+                <wp:positionH relativeFrom="column">
+                  <wp:posOffset>2425065</wp:posOffset>
+                </wp:positionH>
+                <wp:positionV relativeFrom="paragraph">
+                  <wp:posOffset>257810</wp:posOffset>
+                </wp:positionV>
+                <wp:extent cx="3611880" cy="0"/>
+                <wp:effectExtent l="0" t="0" r="0" b="0"/>
+                <wp:wrapNone/>
+                <wp:docPr id="624949995" name="Straight Connector 1"/>
+                <wp:cNvGraphicFramePr/>
+                <a:graphic xmlns:a="http://schemas.openxmlformats.org/drawingml/2006/main">
+                  <a:graphicData uri="http://schemas.microsoft.com/office/word/2010/wordprocessingShape">
+                    <wps:wsp>
+                      <wps:cNvCnPr/>
+                      <wps:spPr>
+                        <a:xfrm>
+                          <a:off x="0" y="0"/>
+                          <a:ext cx="3611880" cy="0"/>
+                        </a:xfrm>
+                        <a:prstGeom prst="line">
+                          <a:avLst/>
+                        </a:prstGeom>
+                        <a:ln w="19050"/>
+                      </wps:spPr>
+                      <wps:style>
+                        <a:lnRef idx="2">
+                          <a:schemeClr val="accent1"/>
+                        </a:lnRef>
+                        <a:fillRef idx="0">
+                          <a:schemeClr val="accent1"/>
+                        </a:fillRef>
+                        <a:effectRef idx="1">
+                          <a:schemeClr val="accent1"/>
+                        </a:effectRef>
+                        <a:fontRef idx="minor">
+                          <a:schemeClr val="tx1"/>
+                        </a:fontRef>
+                      </wps:style>
+                      <wps:bodyPr/>
+                    </wps:wsp>
+                  </a:graphicData>
+                </a:graphic>
+                <wp14:sizeRelH relativeFrom="margin">
+                  <wp14:pctWidth>0</wp14:pctWidth>
+                </wp14:sizeRelH>
+              </wp:anchor>
+            </w:drawing>
+          </mc:Choice>
+          <mc:Fallback>
+            <w:pict>
+              <v:line w14:anchorId="74EFFF15" id="Straight Connector 1" o:spid="_x0000_s1026" style="position:absolute;z-index:251669504;visibility:visible;mso-wrap-style:square;mso-width-percent:0;mso-wrap-distance-left:9pt;mso-wrap-distance-top:0;mso-wrap-distance-right:9pt;mso-wrap-distance-bottom:0;mso-position-horizontal:absolute;mso-position-horizontal-relative:text;mso-position-vertical:absolute;mso-position-vertical-relative:text;mso-width-percent:0;mso-width-relative:margin" from="190.95pt,20.3pt" to="475.35pt,20.3pt" o:gfxdata="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" strokecolor="#156082 [3204]" strokeweight="1.5pt">
+                <v:stroke joinstyle="miter"/>
+              </v:line>
+            </w:pict>
+          </mc:Fallback>
+        </mc:AlternateContent>
+      </w:r>
+      <w:r>
+        <w:rPr>
+          <w:lang w:val="en-US"/>
+        </w:rPr>
+        <w:t>RF-00</w:t>
+      </w:r>
+      <w:r>
+        <w:rPr>
+          <w:lang w:val="en-US"/>
+        </w:rPr>
+        <w:t>6</w:t>
+      </w:r>
+      <w:r>
+        <w:rPr>
+          <w:lang w:val="en-US"/>
+        </w:rPr>
+        <w:t xml:space="preserve"> </w:t>
+      </w:r>
+      <w:r>
+        <w:rPr>
+          <w:lang w:val="en-US"/>
+        </w:rPr>
+        <w:t>Crew Management</w:t>
+      </w:r>
+    </w:p>
+    <w:p>
+      <w:pPr>
+        <w:rPr>
+          <w:lang w:val="en-US"/>
+        </w:rPr>
+      </w:pPr>
+      <w:r>
+        <w:rPr>
+          <w:lang w:val="en-US"/>
+        </w:rPr>
+        <w:t>The system shall for the registration of crews and the assignment of supervisors</w:t>
+      </w:r>
     </w:p>
     <w:p>
       <w:pPr>
@@ -1093,7 +1283,7 @@
         </mc:Choice>
         <mc:Fallback>
           <w:pict>
-            <v:shapetype w14:anchorId="641FE46C" id="_x0000_t120" coordsize="21600,21600" o:spt="120" path="m10800,qx,10800,10800,21600,21600,10800,10800,xe">
+            <v:shapetype w14:anchorId="34ACC57B" id="_x0000_t120" coordsize="21600,21600" o:spt="120" path="m10800,qx,10800,10800,21600,21600,10800,10800,xe">
               <v:path gradientshapeok="t" o:connecttype="custom" o:connectlocs="10800,0;3163,3163;0,10800;3163,18437;10800,21600;18437,18437;21600,10800;18437,3163" textboxrect="3163,3163,18437,18437"/>
             </v:shapetype>
             <v:shape id="Flowchart: Connector 2" o:spid="_x0000_s1026" type="#_x0000_t120" style="position:absolute;margin-left:3.7pt;margin-top:-25.8pt;width:54.9pt;height:54.9pt;z-index:251659264;visibility:visible;mso-wrap-style:square;mso-width-percent:0;mso-height-percent:0;mso-wrap-distance-left:9pt;mso-wrap-distance-top:0;mso-wrap-distance-right:9pt;mso-wrap-distance-bottom:0;mso-position-horizontal:right;mso-position-horizontal-relative:left-margin-area;mso-position-vertical:absolute;mso-position-vertical-relative:text;mso-width-percent:0;mso-height-percent:0;mso-width-relative:margin;mso-height-relative:margin;v-text-anchor:middle" o:gfxdata="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" stroked="f" strokeweight="1pt">
@@ -1943,7 +2133,7 @@
   <w:rsids>
     <w:rsidRoot w:val="003872FF"/>
     <w:rsid w:val="003872FF"/>
-    <w:rsid w:val="005F39AF"/>
+    <w:rsid w:val="00CA64BE"/>
   </w:rsids>
   <m:mathPr>
     <m:mathFont m:val="Cambria Math"/>

</xml_diff>

<commit_message>
add new rf: Production logging and info record
</commit_message>
<xml_diff>
--- a/01-Documentation/03-FunctionalRequeriments/FunctionalRequeriments.docx
+++ b/01-Documentation/03-FunctionalRequeriments/FunctionalRequeriments.docx
@@ -220,13 +220,7 @@
         <w:rPr>
           <w:lang w:val="en-US"/>
         </w:rPr>
-        <w:t>Role Management</w:t>
-      </w:r>
-      <w:r>
-        <w:rPr>
-          <w:lang w:val="en-US"/>
-        </w:rPr>
-        <w:t xml:space="preserve"> </w:t>
+        <w:t xml:space="preserve">Role Management </w:t>
       </w:r>
     </w:p>
     <w:p>
@@ -550,19 +544,7 @@
         <w:rPr>
           <w:lang w:val="en-US"/>
         </w:rPr>
-        <w:t>4</w:t>
-      </w:r>
-      <w:r>
-        <w:rPr>
-          <w:lang w:val="en-US"/>
-        </w:rPr>
-        <w:t xml:space="preserve"> </w:t>
-      </w:r>
-      <w:r>
-        <w:rPr>
-          <w:lang w:val="en-US"/>
-        </w:rPr>
-        <w:t>Plot Management</w:t>
+        <w:t>4 Plot Management</w:t>
       </w:r>
     </w:p>
     <w:p>
@@ -663,19 +645,7 @@
         <w:rPr>
           <w:lang w:val="en-US"/>
         </w:rPr>
-        <w:t>5</w:t>
-      </w:r>
-      <w:r>
-        <w:rPr>
-          <w:lang w:val="en-US"/>
-        </w:rPr>
-        <w:t xml:space="preserve"> </w:t>
-      </w:r>
-      <w:r>
-        <w:rPr>
-          <w:lang w:val="en-US"/>
-        </w:rPr>
-        <w:t>Worker Management</w:t>
+        <w:t>5 Worker Management</w:t>
       </w:r>
     </w:p>
     <w:p>
@@ -782,7 +752,108 @@
         <w:rPr>
           <w:lang w:val="en-US"/>
         </w:rPr>
-        <w:t>6</w:t>
+        <w:t>6 Crew Management</w:t>
+      </w:r>
+    </w:p>
+    <w:p>
+      <w:pPr>
+        <w:rPr>
+          <w:lang w:val="en-US"/>
+        </w:rPr>
+      </w:pPr>
+      <w:r>
+        <w:rPr>
+          <w:lang w:val="en-US"/>
+        </w:rPr>
+        <w:t>The system shall for the registration of crews and the assignment of supervisors</w:t>
+      </w:r>
+    </w:p>
+    <w:p>
+      <w:pPr>
+        <w:pStyle w:val="Heading1"/>
+        <w:rPr>
+          <w:lang w:val="en-US"/>
+        </w:rPr>
+      </w:pPr>
+      <w:r>
+        <w:rPr>
+          <w:noProof/>
+          <w:lang w:val="en-US"/>
+        </w:rPr>
+        <mc:AlternateContent>
+          <mc:Choice Requires="wps">
+            <w:drawing>
+              <wp:anchor distT="0" distB="0" distL="114300" distR="114300" simplePos="0" relativeHeight="251671552" behindDoc="0" locked="0" layoutInCell="1" allowOverlap="1" wp14:anchorId="5F774C2F" wp14:editId="7EB2A15B">
+                <wp:simplePos x="0" y="0"/>
+                <wp:positionH relativeFrom="column">
+                  <wp:posOffset>2425065</wp:posOffset>
+                </wp:positionH>
+                <wp:positionV relativeFrom="paragraph">
+                  <wp:posOffset>257810</wp:posOffset>
+                </wp:positionV>
+                <wp:extent cx="3611880" cy="0"/>
+                <wp:effectExtent l="0" t="0" r="0" b="0"/>
+                <wp:wrapNone/>
+                <wp:docPr id="1155472563" name="Straight Connector 1"/>
+                <wp:cNvGraphicFramePr/>
+                <a:graphic xmlns:a="http://schemas.openxmlformats.org/drawingml/2006/main">
+                  <a:graphicData uri="http://schemas.microsoft.com/office/word/2010/wordprocessingShape">
+                    <wps:wsp>
+                      <wps:cNvCnPr/>
+                      <wps:spPr>
+                        <a:xfrm>
+                          <a:off x="0" y="0"/>
+                          <a:ext cx="3611880" cy="0"/>
+                        </a:xfrm>
+                        <a:prstGeom prst="line">
+                          <a:avLst/>
+                        </a:prstGeom>
+                        <a:ln w="19050"/>
+                      </wps:spPr>
+                      <wps:style>
+                        <a:lnRef idx="2">
+                          <a:schemeClr val="accent1"/>
+                        </a:lnRef>
+                        <a:fillRef idx="0">
+                          <a:schemeClr val="accent1"/>
+                        </a:fillRef>
+                        <a:effectRef idx="1">
+                          <a:schemeClr val="accent1"/>
+                        </a:effectRef>
+                        <a:fontRef idx="minor">
+                          <a:schemeClr val="tx1"/>
+                        </a:fontRef>
+                      </wps:style>
+                      <wps:bodyPr/>
+                    </wps:wsp>
+                  </a:graphicData>
+                </a:graphic>
+                <wp14:sizeRelH relativeFrom="margin">
+                  <wp14:pctWidth>0</wp14:pctWidth>
+                </wp14:sizeRelH>
+              </wp:anchor>
+            </w:drawing>
+          </mc:Choice>
+          <mc:Fallback>
+            <w:pict>
+              <v:line w14:anchorId="56297CF0" id="Straight Connector 1" o:spid="_x0000_s1026" style="position:absolute;z-index:251671552;visibility:visible;mso-wrap-style:square;mso-width-percent:0;mso-wrap-distance-left:9pt;mso-wrap-distance-top:0;mso-wrap-distance-right:9pt;mso-wrap-distance-bottom:0;mso-position-horizontal:absolute;mso-position-horizontal-relative:text;mso-position-vertical:absolute;mso-position-vertical-relative:text;mso-width-percent:0;mso-width-relative:margin" from="190.95pt,20.3pt" to="475.35pt,20.3pt" o:gfxdata="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" strokecolor="#156082 [3204]" strokeweight="1.5pt">
+                <v:stroke joinstyle="miter"/>
+              </v:line>
+            </w:pict>
+          </mc:Fallback>
+        </mc:AlternateContent>
+      </w:r>
+      <w:r>
+        <w:rPr>
+          <w:lang w:val="en-US"/>
+        </w:rPr>
+        <w:t>RF-00</w:t>
+      </w:r>
+      <w:r>
+        <w:rPr>
+          <w:lang w:val="en-US"/>
+        </w:rPr>
+        <w:t>7</w:t>
       </w:r>
       <w:r>
         <w:rPr>
@@ -794,28 +865,183 @@
         <w:rPr>
           <w:lang w:val="en-US"/>
         </w:rPr>
-        <w:t>Crew Management</w:t>
-      </w:r>
-    </w:p>
-    <w:p>
-      <w:pPr>
-        <w:rPr>
-          <w:lang w:val="en-US"/>
-        </w:rPr>
-      </w:pPr>
-      <w:r>
-        <w:rPr>
-          <w:lang w:val="en-US"/>
-        </w:rPr>
-        <w:t>The system shall for the registration of crews and the assignment of supervisors</w:t>
-      </w:r>
-    </w:p>
-    <w:p>
-      <w:pPr>
-        <w:rPr>
-          <w:lang w:val="en-US"/>
-        </w:rPr>
-      </w:pPr>
+        <w:t>Production logging</w:t>
+      </w:r>
+    </w:p>
+    <w:p>
+      <w:pPr>
+        <w:rPr>
+          <w:lang w:val="en-US"/>
+        </w:rPr>
+      </w:pPr>
+      <w:r>
+        <w:rPr>
+          <w:lang w:val="en-US"/>
+        </w:rPr>
+        <w:t>The system shall record:</w:t>
+      </w:r>
+    </w:p>
+    <w:p>
+      <w:pPr>
+        <w:pStyle w:val="ListParagraph"/>
+        <w:numPr>
+          <w:ilvl w:val="0"/>
+          <w:numId w:val="2"/>
+        </w:numPr>
+        <w:rPr>
+          <w:lang w:val="en-US"/>
+        </w:rPr>
+      </w:pPr>
+      <w:r>
+        <w:rPr>
+          <w:lang w:val="en-US"/>
+        </w:rPr>
+        <w:t>Date</w:t>
+      </w:r>
+    </w:p>
+    <w:p>
+      <w:pPr>
+        <w:pStyle w:val="ListParagraph"/>
+        <w:numPr>
+          <w:ilvl w:val="0"/>
+          <w:numId w:val="2"/>
+        </w:numPr>
+        <w:rPr>
+          <w:lang w:val="en-US"/>
+        </w:rPr>
+      </w:pPr>
+      <w:r>
+        <w:rPr>
+          <w:lang w:val="en-US"/>
+        </w:rPr>
+        <w:t>Farm</w:t>
+      </w:r>
+    </w:p>
+    <w:p>
+      <w:pPr>
+        <w:pStyle w:val="ListParagraph"/>
+        <w:numPr>
+          <w:ilvl w:val="0"/>
+          <w:numId w:val="2"/>
+        </w:numPr>
+        <w:rPr>
+          <w:lang w:val="en-US"/>
+        </w:rPr>
+      </w:pPr>
+      <w:r>
+        <w:rPr>
+          <w:lang w:val="en-US"/>
+        </w:rPr>
+        <w:t>Plot</w:t>
+      </w:r>
+    </w:p>
+    <w:p>
+      <w:pPr>
+        <w:pStyle w:val="ListParagraph"/>
+        <w:numPr>
+          <w:ilvl w:val="0"/>
+          <w:numId w:val="2"/>
+        </w:numPr>
+        <w:rPr>
+          <w:lang w:val="en-US"/>
+        </w:rPr>
+      </w:pPr>
+      <w:r>
+        <w:rPr>
+          <w:lang w:val="en-US"/>
+        </w:rPr>
+        <w:t>Crew</w:t>
+      </w:r>
+    </w:p>
+    <w:p>
+      <w:pPr>
+        <w:pStyle w:val="ListParagraph"/>
+        <w:numPr>
+          <w:ilvl w:val="0"/>
+          <w:numId w:val="2"/>
+        </w:numPr>
+        <w:rPr>
+          <w:lang w:val="en-US"/>
+        </w:rPr>
+      </w:pPr>
+      <w:r>
+        <w:rPr>
+          <w:lang w:val="en-US"/>
+        </w:rPr>
+        <w:t>Worker</w:t>
+      </w:r>
+    </w:p>
+    <w:p>
+      <w:pPr>
+        <w:pStyle w:val="ListParagraph"/>
+        <w:numPr>
+          <w:ilvl w:val="0"/>
+          <w:numId w:val="2"/>
+        </w:numPr>
+        <w:rPr>
+          <w:lang w:val="en-US"/>
+        </w:rPr>
+      </w:pPr>
+      <w:r>
+        <w:rPr>
+          <w:lang w:val="en-US"/>
+        </w:rPr>
+        <w:t>Variety</w:t>
+      </w:r>
+    </w:p>
+    <w:p>
+      <w:pPr>
+        <w:pStyle w:val="ListParagraph"/>
+        <w:numPr>
+          <w:ilvl w:val="0"/>
+          <w:numId w:val="2"/>
+        </w:numPr>
+        <w:rPr>
+          <w:lang w:val="en-US"/>
+        </w:rPr>
+      </w:pPr>
+      <w:r>
+        <w:rPr>
+          <w:lang w:val="en-US"/>
+        </w:rPr>
+        <w:t>Export crates</w:t>
+      </w:r>
+    </w:p>
+    <w:p>
+      <w:pPr>
+        <w:pStyle w:val="ListParagraph"/>
+        <w:numPr>
+          <w:ilvl w:val="0"/>
+          <w:numId w:val="2"/>
+        </w:numPr>
+        <w:rPr>
+          <w:lang w:val="en-US"/>
+        </w:rPr>
+      </w:pPr>
+      <w:r>
+        <w:rPr>
+          <w:lang w:val="en-US"/>
+        </w:rPr>
+        <w:t>IQF crates</w:t>
+      </w:r>
+    </w:p>
+    <w:p>
+      <w:pPr>
+        <w:pStyle w:val="ListParagraph"/>
+        <w:numPr>
+          <w:ilvl w:val="0"/>
+          <w:numId w:val="2"/>
+        </w:numPr>
+        <w:rPr>
+          <w:lang w:val="en-US"/>
+        </w:rPr>
+      </w:pPr>
+      <w:r>
+        <w:rPr>
+          <w:lang w:val="en-US"/>
+        </w:rPr>
+        <w:t>Cull/Discard crates</w:t>
+      </w:r>
     </w:p>
     <w:p>
       <w:pPr>
@@ -1451,8 +1677,124 @@
       </w:rPr>
     </w:lvl>
   </w:abstractNum>
+  <w:abstractNum w:abstractNumId="1" w15:restartNumberingAfterBreak="0">
+    <w:nsid w:val="78064489"/>
+    <w:multiLevelType w:val="hybridMultilevel"/>
+    <w:tmpl w:val="E0D6173E"/>
+    <w:lvl w:ilvl="0" w:tplc="0C0A0001">
+      <w:start w:val="1"/>
+      <w:numFmt w:val="bullet"/>
+      <w:lvlText w:val=""/>
+      <w:lvlJc w:val="left"/>
+      <w:pPr>
+        <w:ind w:left="720" w:hanging="360"/>
+      </w:pPr>
+      <w:rPr>
+        <w:rFonts w:ascii="Symbol" w:hAnsi="Symbol" w:hint="default"/>
+      </w:rPr>
+    </w:lvl>
+    <w:lvl w:ilvl="1" w:tplc="0C0A0003" w:tentative="1">
+      <w:start w:val="1"/>
+      <w:numFmt w:val="bullet"/>
+      <w:lvlText w:val="o"/>
+      <w:lvlJc w:val="left"/>
+      <w:pPr>
+        <w:ind w:left="1440" w:hanging="360"/>
+      </w:pPr>
+      <w:rPr>
+        <w:rFonts w:ascii="Courier New" w:hAnsi="Courier New" w:cs="Courier New" w:hint="default"/>
+      </w:rPr>
+    </w:lvl>
+    <w:lvl w:ilvl="2" w:tplc="0C0A0005" w:tentative="1">
+      <w:start w:val="1"/>
+      <w:numFmt w:val="bullet"/>
+      <w:lvlText w:val=""/>
+      <w:lvlJc w:val="left"/>
+      <w:pPr>
+        <w:ind w:left="2160" w:hanging="360"/>
+      </w:pPr>
+      <w:rPr>
+        <w:rFonts w:ascii="Wingdings" w:hAnsi="Wingdings" w:hint="default"/>
+      </w:rPr>
+    </w:lvl>
+    <w:lvl w:ilvl="3" w:tplc="0C0A0001" w:tentative="1">
+      <w:start w:val="1"/>
+      <w:numFmt w:val="bullet"/>
+      <w:lvlText w:val=""/>
+      <w:lvlJc w:val="left"/>
+      <w:pPr>
+        <w:ind w:left="2880" w:hanging="360"/>
+      </w:pPr>
+      <w:rPr>
+        <w:rFonts w:ascii="Symbol" w:hAnsi="Symbol" w:hint="default"/>
+      </w:rPr>
+    </w:lvl>
+    <w:lvl w:ilvl="4" w:tplc="0C0A0003" w:tentative="1">
+      <w:start w:val="1"/>
+      <w:numFmt w:val="bullet"/>
+      <w:lvlText w:val="o"/>
+      <w:lvlJc w:val="left"/>
+      <w:pPr>
+        <w:ind w:left="3600" w:hanging="360"/>
+      </w:pPr>
+      <w:rPr>
+        <w:rFonts w:ascii="Courier New" w:hAnsi="Courier New" w:cs="Courier New" w:hint="default"/>
+      </w:rPr>
+    </w:lvl>
+    <w:lvl w:ilvl="5" w:tplc="0C0A0005" w:tentative="1">
+      <w:start w:val="1"/>
+      <w:numFmt w:val="bullet"/>
+      <w:lvlText w:val=""/>
+      <w:lvlJc w:val="left"/>
+      <w:pPr>
+        <w:ind w:left="4320" w:hanging="360"/>
+      </w:pPr>
+      <w:rPr>
+        <w:rFonts w:ascii="Wingdings" w:hAnsi="Wingdings" w:hint="default"/>
+      </w:rPr>
+    </w:lvl>
+    <w:lvl w:ilvl="6" w:tplc="0C0A0001" w:tentative="1">
+      <w:start w:val="1"/>
+      <w:numFmt w:val="bullet"/>
+      <w:lvlText w:val=""/>
+      <w:lvlJc w:val="left"/>
+      <w:pPr>
+        <w:ind w:left="5040" w:hanging="360"/>
+      </w:pPr>
+      <w:rPr>
+        <w:rFonts w:ascii="Symbol" w:hAnsi="Symbol" w:hint="default"/>
+      </w:rPr>
+    </w:lvl>
+    <w:lvl w:ilvl="7" w:tplc="0C0A0003" w:tentative="1">
+      <w:start w:val="1"/>
+      <w:numFmt w:val="bullet"/>
+      <w:lvlText w:val="o"/>
+      <w:lvlJc w:val="left"/>
+      <w:pPr>
+        <w:ind w:left="5760" w:hanging="360"/>
+      </w:pPr>
+      <w:rPr>
+        <w:rFonts w:ascii="Courier New" w:hAnsi="Courier New" w:cs="Courier New" w:hint="default"/>
+      </w:rPr>
+    </w:lvl>
+    <w:lvl w:ilvl="8" w:tplc="0C0A0005" w:tentative="1">
+      <w:start w:val="1"/>
+      <w:numFmt w:val="bullet"/>
+      <w:lvlText w:val=""/>
+      <w:lvlJc w:val="left"/>
+      <w:pPr>
+        <w:ind w:left="6480" w:hanging="360"/>
+      </w:pPr>
+      <w:rPr>
+        <w:rFonts w:ascii="Wingdings" w:hAnsi="Wingdings" w:hint="default"/>
+      </w:rPr>
+    </w:lvl>
+  </w:abstractNum>
   <w:num w:numId="1" w16cid:durableId="837577840">
     <w:abstractNumId w:val="0"/>
+  </w:num>
+  <w:num w:numId="2" w16cid:durableId="230045869">
+    <w:abstractNumId w:val="1"/>
   </w:num>
 </w:numbering>
 </file>
@@ -2133,7 +2475,9 @@
   <w:rsids>
     <w:rsidRoot w:val="003872FF"/>
     <w:rsid w:val="003872FF"/>
+    <w:rsid w:val="00463550"/>
     <w:rsid w:val="00CA64BE"/>
+    <w:rsid w:val="00FC6776"/>
   </w:rsids>
   <m:mathPr>
     <m:mathFont m:val="Cambria Math"/>

</xml_diff>

<commit_message>
add new rf: Operational dashboard module
</commit_message>
<xml_diff>
--- a/01-Documentation/03-FunctionalRequeriments/FunctionalRequeriments.docx
+++ b/01-Documentation/03-FunctionalRequeriments/FunctionalRequeriments.docx
@@ -836,7 +836,7 @@
           </mc:Choice>
           <mc:Fallback>
             <w:pict>
-              <v:line w14:anchorId="56297CF0" id="Straight Connector 1" o:spid="_x0000_s1026" style="position:absolute;z-index:251671552;visibility:visible;mso-wrap-style:square;mso-width-percent:0;mso-wrap-distance-left:9pt;mso-wrap-distance-top:0;mso-wrap-distance-right:9pt;mso-wrap-distance-bottom:0;mso-position-horizontal:absolute;mso-position-horizontal-relative:text;mso-position-vertical:absolute;mso-position-vertical-relative:text;mso-width-percent:0;mso-width-relative:margin" from="190.95pt,20.3pt" to="475.35pt,20.3pt" o:gfxdata="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" strokecolor="#156082 [3204]" strokeweight="1.5pt">
+              <v:line w14:anchorId="07EC3D30" id="Straight Connector 1" o:spid="_x0000_s1026" style="position:absolute;z-index:251671552;visibility:visible;mso-wrap-style:square;mso-width-percent:0;mso-wrap-distance-left:9pt;mso-wrap-distance-top:0;mso-wrap-distance-right:9pt;mso-wrap-distance-bottom:0;mso-position-horizontal:absolute;mso-position-horizontal-relative:text;mso-position-vertical:absolute;mso-position-vertical-relative:text;mso-width-percent:0;mso-width-relative:margin" from="190.95pt,20.3pt" to="475.35pt,20.3pt" o:gfxdata="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" strokecolor="#156082 [3204]" strokeweight="1.5pt">
                 <v:stroke joinstyle="miter"/>
               </v:line>
             </w:pict>
@@ -1041,6 +1041,120 @@
           <w:lang w:val="en-US"/>
         </w:rPr>
         <w:t>Cull/Discard crates</w:t>
+      </w:r>
+    </w:p>
+    <w:p>
+      <w:pPr>
+        <w:pStyle w:val="Heading1"/>
+        <w:rPr>
+          <w:lang w:val="en-US"/>
+        </w:rPr>
+      </w:pPr>
+      <w:r>
+        <w:rPr>
+          <w:noProof/>
+          <w:lang w:val="en-US"/>
+        </w:rPr>
+        <w:lastRenderedPageBreak/>
+        <mc:AlternateContent>
+          <mc:Choice Requires="wps">
+            <w:drawing>
+              <wp:anchor distT="0" distB="0" distL="114300" distR="114300" simplePos="0" relativeHeight="251673600" behindDoc="0" locked="0" layoutInCell="1" allowOverlap="1" wp14:anchorId="168907F3" wp14:editId="754616D9">
+                <wp:simplePos x="0" y="0"/>
+                <wp:positionH relativeFrom="column">
+                  <wp:posOffset>2668905</wp:posOffset>
+                </wp:positionH>
+                <wp:positionV relativeFrom="paragraph">
+                  <wp:posOffset>258445</wp:posOffset>
+                </wp:positionV>
+                <wp:extent cx="3368040" cy="0"/>
+                <wp:effectExtent l="0" t="0" r="0" b="0"/>
+                <wp:wrapNone/>
+                <wp:docPr id="1229407628" name="Straight Connector 1"/>
+                <wp:cNvGraphicFramePr/>
+                <a:graphic xmlns:a="http://schemas.openxmlformats.org/drawingml/2006/main">
+                  <a:graphicData uri="http://schemas.microsoft.com/office/word/2010/wordprocessingShape">
+                    <wps:wsp>
+                      <wps:cNvCnPr/>
+                      <wps:spPr>
+                        <a:xfrm>
+                          <a:off x="0" y="0"/>
+                          <a:ext cx="3368040" cy="0"/>
+                        </a:xfrm>
+                        <a:prstGeom prst="line">
+                          <a:avLst/>
+                        </a:prstGeom>
+                        <a:ln w="19050"/>
+                      </wps:spPr>
+                      <wps:style>
+                        <a:lnRef idx="2">
+                          <a:schemeClr val="accent1"/>
+                        </a:lnRef>
+                        <a:fillRef idx="0">
+                          <a:schemeClr val="accent1"/>
+                        </a:fillRef>
+                        <a:effectRef idx="1">
+                          <a:schemeClr val="accent1"/>
+                        </a:effectRef>
+                        <a:fontRef idx="minor">
+                          <a:schemeClr val="tx1"/>
+                        </a:fontRef>
+                      </wps:style>
+                      <wps:bodyPr/>
+                    </wps:wsp>
+                  </a:graphicData>
+                </a:graphic>
+                <wp14:sizeRelH relativeFrom="margin">
+                  <wp14:pctWidth>0</wp14:pctWidth>
+                </wp14:sizeRelH>
+              </wp:anchor>
+            </w:drawing>
+          </mc:Choice>
+          <mc:Fallback>
+            <w:pict>
+              <v:line w14:anchorId="1A5296B6" id="Straight Connector 1" o:spid="_x0000_s1026" style="position:absolute;z-index:251673600;visibility:visible;mso-wrap-style:square;mso-width-percent:0;mso-wrap-distance-left:9pt;mso-wrap-distance-top:0;mso-wrap-distance-right:9pt;mso-wrap-distance-bottom:0;mso-position-horizontal:absolute;mso-position-horizontal-relative:text;mso-position-vertical:absolute;mso-position-vertical-relative:text;mso-width-percent:0;mso-width-relative:margin" from="210.15pt,20.35pt" to="475.35pt,20.35pt" o:gfxdata="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" strokecolor="#156082 [3204]" strokeweight="1.5pt">
+                <v:stroke joinstyle="miter"/>
+              </v:line>
+            </w:pict>
+          </mc:Fallback>
+        </mc:AlternateContent>
+      </w:r>
+      <w:r>
+        <w:rPr>
+          <w:lang w:val="en-US"/>
+        </w:rPr>
+        <w:t>RF-00</w:t>
+      </w:r>
+      <w:r>
+        <w:rPr>
+          <w:lang w:val="en-US"/>
+        </w:rPr>
+        <w:t>8</w:t>
+      </w:r>
+      <w:r>
+        <w:rPr>
+          <w:lang w:val="en-US"/>
+        </w:rPr>
+        <w:t xml:space="preserve"> </w:t>
+      </w:r>
+      <w:r>
+        <w:rPr>
+          <w:lang w:val="en-US"/>
+        </w:rPr>
+        <w:t>Operational Dashboard</w:t>
+      </w:r>
+    </w:p>
+    <w:p>
+      <w:pPr>
+        <w:rPr>
+          <w:lang w:val="en-US"/>
+        </w:rPr>
+      </w:pPr>
+      <w:r>
+        <w:rPr>
+          <w:lang w:val="en-US"/>
+        </w:rPr>
+        <w:t>The system shall display operational indicators in real-time and data decision</w:t>
       </w:r>
     </w:p>
     <w:p>
@@ -2474,10 +2588,10 @@
   </w:compat>
   <w:rsids>
     <w:rsidRoot w:val="003872FF"/>
+    <w:rsid w:val="00197249"/>
     <w:rsid w:val="003872FF"/>
     <w:rsid w:val="00463550"/>
     <w:rsid w:val="00CA64BE"/>
-    <w:rsid w:val="00FC6776"/>
   </w:rsids>
   <m:mathPr>
     <m:mathFont m:val="Cambria Math"/>

</xml_diff>

<commit_message>
add two rf: Poructivuty alerts recommendations engine
</commit_message>
<xml_diff>
--- a/01-Documentation/03-FunctionalRequeriments/FunctionalRequeriments.docx
+++ b/01-Documentation/03-FunctionalRequeriments/FunctionalRequeriments.docx
@@ -836,7 +836,7 @@
           </mc:Choice>
           <mc:Fallback>
             <w:pict>
-              <v:line w14:anchorId="07EC3D30" id="Straight Connector 1" o:spid="_x0000_s1026" style="position:absolute;z-index:251671552;visibility:visible;mso-wrap-style:square;mso-width-percent:0;mso-wrap-distance-left:9pt;mso-wrap-distance-top:0;mso-wrap-distance-right:9pt;mso-wrap-distance-bottom:0;mso-position-horizontal:absolute;mso-position-horizontal-relative:text;mso-position-vertical:absolute;mso-position-vertical-relative:text;mso-width-percent:0;mso-width-relative:margin" from="190.95pt,20.3pt" to="475.35pt,20.3pt" o:gfxdata="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" strokecolor="#156082 [3204]" strokeweight="1.5pt">
+              <v:line w14:anchorId="72025CC0" id="Straight Connector 1" o:spid="_x0000_s1026" style="position:absolute;z-index:251671552;visibility:visible;mso-wrap-style:square;mso-width-percent:0;mso-wrap-distance-left:9pt;mso-wrap-distance-top:0;mso-wrap-distance-right:9pt;mso-wrap-distance-bottom:0;mso-position-horizontal:absolute;mso-position-horizontal-relative:text;mso-position-vertical:absolute;mso-position-vertical-relative:text;mso-width-percent:0;mso-width-relative:margin" from="190.95pt,20.3pt" to="475.35pt,20.3pt" o:gfxdata="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" strokecolor="#156082 [3204]" strokeweight="1.5pt">
                 <v:stroke joinstyle="miter"/>
               </v:line>
             </w:pict>
@@ -1112,7 +1112,7 @@
           </mc:Choice>
           <mc:Fallback>
             <w:pict>
-              <v:line w14:anchorId="1A5296B6" id="Straight Connector 1" o:spid="_x0000_s1026" style="position:absolute;z-index:251673600;visibility:visible;mso-wrap-style:square;mso-width-percent:0;mso-wrap-distance-left:9pt;mso-wrap-distance-top:0;mso-wrap-distance-right:9pt;mso-wrap-distance-bottom:0;mso-position-horizontal:absolute;mso-position-horizontal-relative:text;mso-position-vertical:absolute;mso-position-vertical-relative:text;mso-width-percent:0;mso-width-relative:margin" from="210.15pt,20.35pt" to="475.35pt,20.35pt" o:gfxdata="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" strokecolor="#156082 [3204]" strokeweight="1.5pt">
+              <v:line w14:anchorId="27CEFCA0" id="Straight Connector 1" o:spid="_x0000_s1026" style="position:absolute;z-index:251673600;visibility:visible;mso-wrap-style:square;mso-width-percent:0;mso-wrap-distance-left:9pt;mso-wrap-distance-top:0;mso-wrap-distance-right:9pt;mso-wrap-distance-bottom:0;mso-position-horizontal:absolute;mso-position-horizontal-relative:text;mso-position-vertical:absolute;mso-position-vertical-relative:text;mso-width-percent:0;mso-width-relative:margin" from="210.15pt,20.35pt" to="475.35pt,20.35pt" o:gfxdata="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" strokecolor="#156082 [3204]" strokeweight="1.5pt">
                 <v:stroke joinstyle="miter"/>
               </v:line>
             </w:pict>
@@ -1155,6 +1155,220 @@
           <w:lang w:val="en-US"/>
         </w:rPr>
         <w:t>The system shall display operational indicators in real-time and data decision</w:t>
+      </w:r>
+    </w:p>
+    <w:p>
+      <w:pPr>
+        <w:pStyle w:val="Heading1"/>
+        <w:rPr>
+          <w:lang w:val="en-US"/>
+        </w:rPr>
+      </w:pPr>
+      <w:r>
+        <w:rPr>
+          <w:noProof/>
+          <w:lang w:val="en-US"/>
+        </w:rPr>
+        <mc:AlternateContent>
+          <mc:Choice Requires="wps">
+            <w:drawing>
+              <wp:anchor distT="0" distB="0" distL="114300" distR="114300" simplePos="0" relativeHeight="251675648" behindDoc="0" locked="0" layoutInCell="1" allowOverlap="1" wp14:anchorId="5AE6D012" wp14:editId="63C93793">
+                <wp:simplePos x="0" y="0"/>
+                <wp:positionH relativeFrom="column">
+                  <wp:posOffset>2425065</wp:posOffset>
+                </wp:positionH>
+                <wp:positionV relativeFrom="paragraph">
+                  <wp:posOffset>257810</wp:posOffset>
+                </wp:positionV>
+                <wp:extent cx="3611880" cy="0"/>
+                <wp:effectExtent l="0" t="0" r="0" b="0"/>
+                <wp:wrapNone/>
+                <wp:docPr id="1049419919" name="Straight Connector 1"/>
+                <wp:cNvGraphicFramePr/>
+                <a:graphic xmlns:a="http://schemas.openxmlformats.org/drawingml/2006/main">
+                  <a:graphicData uri="http://schemas.microsoft.com/office/word/2010/wordprocessingShape">
+                    <wps:wsp>
+                      <wps:cNvCnPr/>
+                      <wps:spPr>
+                        <a:xfrm>
+                          <a:off x="0" y="0"/>
+                          <a:ext cx="3611880" cy="0"/>
+                        </a:xfrm>
+                        <a:prstGeom prst="line">
+                          <a:avLst/>
+                        </a:prstGeom>
+                        <a:ln w="19050"/>
+                      </wps:spPr>
+                      <wps:style>
+                        <a:lnRef idx="2">
+                          <a:schemeClr val="accent1"/>
+                        </a:lnRef>
+                        <a:fillRef idx="0">
+                          <a:schemeClr val="accent1"/>
+                        </a:fillRef>
+                        <a:effectRef idx="1">
+                          <a:schemeClr val="accent1"/>
+                        </a:effectRef>
+                        <a:fontRef idx="minor">
+                          <a:schemeClr val="tx1"/>
+                        </a:fontRef>
+                      </wps:style>
+                      <wps:bodyPr/>
+                    </wps:wsp>
+                  </a:graphicData>
+                </a:graphic>
+                <wp14:sizeRelH relativeFrom="margin">
+                  <wp14:pctWidth>0</wp14:pctWidth>
+                </wp14:sizeRelH>
+              </wp:anchor>
+            </w:drawing>
+          </mc:Choice>
+          <mc:Fallback>
+            <w:pict>
+              <v:line w14:anchorId="0EFA7AB7" id="Straight Connector 1" o:spid="_x0000_s1026" style="position:absolute;z-index:251675648;visibility:visible;mso-wrap-style:square;mso-width-percent:0;mso-wrap-distance-left:9pt;mso-wrap-distance-top:0;mso-wrap-distance-right:9pt;mso-wrap-distance-bottom:0;mso-position-horizontal:absolute;mso-position-horizontal-relative:text;mso-position-vertical:absolute;mso-position-vertical-relative:text;mso-width-percent:0;mso-width-relative:margin" from="190.95pt,20.3pt" to="475.35pt,20.3pt" o:gfxdata="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" strokecolor="#156082 [3204]" strokeweight="1.5pt">
+                <v:stroke joinstyle="miter"/>
+              </v:line>
+            </w:pict>
+          </mc:Fallback>
+        </mc:AlternateContent>
+      </w:r>
+      <w:r>
+        <w:rPr>
+          <w:lang w:val="en-US"/>
+        </w:rPr>
+        <w:t>RF-00</w:t>
+      </w:r>
+      <w:r>
+        <w:rPr>
+          <w:lang w:val="en-US"/>
+        </w:rPr>
+        <w:t>9 Productivity Alerts</w:t>
+      </w:r>
+    </w:p>
+    <w:p>
+      <w:pPr>
+        <w:rPr>
+          <w:lang w:val="en-US"/>
+        </w:rPr>
+      </w:pPr>
+      <w:r>
+        <w:rPr>
+          <w:lang w:val="en-US"/>
+        </w:rPr>
+        <w:t>The system shall automatically detect drops in productivity</w:t>
+      </w:r>
+    </w:p>
+    <w:p>
+      <w:pPr>
+        <w:pStyle w:val="Heading1"/>
+        <w:rPr>
+          <w:lang w:val="en-US"/>
+        </w:rPr>
+      </w:pPr>
+      <w:r>
+        <w:rPr>
+          <w:noProof/>
+          <w:lang w:val="en-US"/>
+        </w:rPr>
+        <mc:AlternateContent>
+          <mc:Choice Requires="wps">
+            <w:drawing>
+              <wp:anchor distT="0" distB="0" distL="114300" distR="114300" simplePos="0" relativeHeight="251677696" behindDoc="0" locked="0" layoutInCell="1" allowOverlap="1" wp14:anchorId="60AA22B0" wp14:editId="4EE63224">
+                <wp:simplePos x="0" y="0"/>
+                <wp:positionH relativeFrom="column">
+                  <wp:posOffset>2729865</wp:posOffset>
+                </wp:positionH>
+                <wp:positionV relativeFrom="paragraph">
+                  <wp:posOffset>259080</wp:posOffset>
+                </wp:positionV>
+                <wp:extent cx="3307080" cy="0"/>
+                <wp:effectExtent l="0" t="0" r="0" b="0"/>
+                <wp:wrapNone/>
+                <wp:docPr id="1697858792" name="Straight Connector 1"/>
+                <wp:cNvGraphicFramePr/>
+                <a:graphic xmlns:a="http://schemas.openxmlformats.org/drawingml/2006/main">
+                  <a:graphicData uri="http://schemas.microsoft.com/office/word/2010/wordprocessingShape">
+                    <wps:wsp>
+                      <wps:cNvCnPr/>
+                      <wps:spPr>
+                        <a:xfrm>
+                          <a:off x="0" y="0"/>
+                          <a:ext cx="3307080" cy="0"/>
+                        </a:xfrm>
+                        <a:prstGeom prst="line">
+                          <a:avLst/>
+                        </a:prstGeom>
+                        <a:ln w="19050"/>
+                      </wps:spPr>
+                      <wps:style>
+                        <a:lnRef idx="2">
+                          <a:schemeClr val="accent1"/>
+                        </a:lnRef>
+                        <a:fillRef idx="0">
+                          <a:schemeClr val="accent1"/>
+                        </a:fillRef>
+                        <a:effectRef idx="1">
+                          <a:schemeClr val="accent1"/>
+                        </a:effectRef>
+                        <a:fontRef idx="minor">
+                          <a:schemeClr val="tx1"/>
+                        </a:fontRef>
+                      </wps:style>
+                      <wps:bodyPr/>
+                    </wps:wsp>
+                  </a:graphicData>
+                </a:graphic>
+                <wp14:sizeRelH relativeFrom="margin">
+                  <wp14:pctWidth>0</wp14:pctWidth>
+                </wp14:sizeRelH>
+              </wp:anchor>
+            </w:drawing>
+          </mc:Choice>
+          <mc:Fallback>
+            <w:pict>
+              <v:line w14:anchorId="08F7EE69" id="Straight Connector 1" o:spid="_x0000_s1026" style="position:absolute;z-index:251677696;visibility:visible;mso-wrap-style:square;mso-width-percent:0;mso-wrap-distance-left:9pt;mso-wrap-distance-top:0;mso-wrap-distance-right:9pt;mso-wrap-distance-bottom:0;mso-position-horizontal:absolute;mso-position-horizontal-relative:text;mso-position-vertical:absolute;mso-position-vertical-relative:text;mso-width-percent:0;mso-width-relative:margin" from="214.95pt,20.4pt" to="475.35pt,20.4pt" o:gfxdata="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" strokecolor="#156082 [3204]" strokeweight="1.5pt">
+                <v:stroke joinstyle="miter"/>
+              </v:line>
+            </w:pict>
+          </mc:Fallback>
+        </mc:AlternateContent>
+      </w:r>
+      <w:r>
+        <w:rPr>
+          <w:lang w:val="en-US"/>
+        </w:rPr>
+        <w:t>RF-0</w:t>
+      </w:r>
+      <w:r>
+        <w:rPr>
+          <w:lang w:val="en-US"/>
+        </w:rPr>
+        <w:t>10</w:t>
+      </w:r>
+      <w:r>
+        <w:rPr>
+          <w:lang w:val="en-US"/>
+        </w:rPr>
+        <w:t xml:space="preserve"> </w:t>
+      </w:r>
+      <w:r>
+        <w:rPr>
+          <w:lang w:val="en-US"/>
+        </w:rPr>
+        <w:t>Recommendation engine</w:t>
+      </w:r>
+    </w:p>
+    <w:p>
+      <w:pPr>
+        <w:rPr>
+          <w:lang w:val="en-US"/>
+        </w:rPr>
+      </w:pPr>
+      <w:r>
+        <w:rPr>
+          <w:lang w:val="en-US"/>
+        </w:rPr>
+        <w:t>The system shall generate recommendations to improve operational productivity</w:t>
       </w:r>
     </w:p>
     <w:p>
@@ -2588,7 +2802,7 @@
   </w:compat>
   <w:rsids>
     <w:rsidRoot w:val="003872FF"/>
-    <w:rsid w:val="00197249"/>
+    <w:rsid w:val="003407EA"/>
     <w:rsid w:val="003872FF"/>
     <w:rsid w:val="00463550"/>
     <w:rsid w:val="00CA64BE"/>

</xml_diff>

<commit_message>
add new RF: iNtelligence queries
</commit_message>
<xml_diff>
--- a/01-Documentation/03-FunctionalRequeriments/FunctionalRequeriments.docx
+++ b/01-Documentation/03-FunctionalRequeriments/FunctionalRequeriments.docx
@@ -1,6 +1,6 @@
 
 <file path=word/document.xml><?xml version="1.0" encoding="utf-8"?>
-<w:document xmlns:wpc="http://schemas.microsoft.com/office/word/2010/wordprocessingCanvas" xmlns:cx="http://schemas.microsoft.com/office/drawing/2014/chartex" xmlns:cx1="http://schemas.microsoft.com/office/drawing/2015/9/8/chartex" xmlns:cx2="http://schemas.microsoft.com/office/drawing/2015/10/21/chartex" xmlns:cx3="http://schemas.microsoft.com/office/drawing/2016/5/9/chartex" xmlns:cx4="http://schemas.microsoft.com/office/drawing/2016/5/10/chartex" xmlns:cx5="http://schemas.microsoft.com/office/drawing/2016/5/11/chartex" xmlns:cx6="http://schemas.microsoft.com/office/drawing/2016/5/12/chartex" xmlns:cx7="http://schemas.microsoft.com/office/drawing/2016/5/13/chartex" xmlns:cx8="http://schemas.microsoft.com/office/drawing/2016/5/14/chartex" xmlns:mc="http://schemas.openxmlformats.org/markup-compatibility/2006" xmlns:aink="http://schemas.microsoft.com/office/drawing/2016/ink" xmlns:am3d="http://schemas.microsoft.com/office/drawing/2017/model3d" xmlns:o="urn:schemas-microsoft-com:office:office" xmlns:oel="http://schemas.microsoft.com/office/2019/extlst" xmlns:r="http://schemas.openxmlformats.org/officeDocument/2006/relationships" xmlns:m="http://schemas.openxmlformats.org/officeDocument/2006/math" xmlns:v="urn:schemas-microsoft-com:vml" xmlns:wp14="http://schemas.microsoft.com/office/word/2010/wordprocessingDrawing" xmlns:wp="http://schemas.openxmlformats.org/drawingml/2006/wordprocessingDrawing" xmlns:w10="urn:schemas-microsoft-com:office:word" xmlns:w="http://schemas.openxmlformats.org/wordprocessingml/2006/main" xmlns:w14="http://schemas.microsoft.com/office/word/2010/wordml" xmlns:w15="http://schemas.microsoft.com/office/word/2012/wordml" xmlns:w16cex="http://schemas.microsoft.com/office/word/2018/wordml/cex" xmlns:w16cid="http://schemas.microsoft.com/office/word/2016/wordml/cid" xmlns:w16="http://schemas.microsoft.com/office/word/2018/wordml" xmlns:w16du="http://schemas.microsoft.com/office/word/2023/wordml/word16du" xmlns:w16sdtdh="http://schemas.microsoft.com/office/word/2020/wordml/sdtdatahash" xmlns:w16se="http://schemas.microsoft.com/office/word/2015/wordml/symex" xmlns:wpg="http://schemas.microsoft.com/office/word/2010/wordprocessingGroup" xmlns:wpi="http://schemas.microsoft.com/office/word/2010/wordprocessingInk" xmlns:wne="http://schemas.microsoft.com/office/word/2006/wordml" xmlns:wps="http://schemas.microsoft.com/office/word/2010/wordprocessingShape" mc:Ignorable="w14 w15 w16se w16cid w16 w16cex w16sdtdh wp14">
+<w:document xmlns:wpc="http://schemas.microsoft.com/office/word/2010/wordprocessingCanvas" xmlns:cx="http://schemas.microsoft.com/office/drawing/2014/chartex" xmlns:cx1="http://schemas.microsoft.com/office/drawing/2015/9/8/chartex" xmlns:cx2="http://schemas.microsoft.com/office/drawing/2015/10/21/chartex" xmlns:cx3="http://schemas.microsoft.com/office/drawing/2016/5/9/chartex" xmlns:cx4="http://schemas.microsoft.com/office/drawing/2016/5/10/chartex" xmlns:cx5="http://schemas.microsoft.com/office/drawing/2016/5/11/chartex" xmlns:cx6="http://schemas.microsoft.com/office/drawing/2016/5/12/chartex" xmlns:cx7="http://schemas.microsoft.com/office/drawing/2016/5/13/chartex" xmlns:cx8="http://schemas.microsoft.com/office/drawing/2016/5/14/chartex" xmlns:mc="http://schemas.openxmlformats.org/markup-compatibility/2006" xmlns:aink="http://schemas.microsoft.com/office/drawing/2016/ink" xmlns:am3d="http://schemas.microsoft.com/office/drawing/2017/model3d" xmlns:o="urn:schemas-microsoft-com:office:office" xmlns:oel="http://schemas.microsoft.com/office/2019/extlst" xmlns:r="http://schemas.openxmlformats.org/officeDocument/2006/relationships" xmlns:m="http://schemas.openxmlformats.org/officeDocument/2006/math" xmlns:v="urn:schemas-microsoft-com:vml" xmlns:wp14="http://schemas.microsoft.com/office/word/2010/wordprocessingDrawing" xmlns:wp="http://schemas.openxmlformats.org/drawingml/2006/wordprocessingDrawing" xmlns:w10="urn:schemas-microsoft-com:office:word" xmlns:w="http://schemas.openxmlformats.org/wordprocessingml/2006/main" xmlns:w14="http://schemas.microsoft.com/office/word/2010/wordml" xmlns:w15="http://schemas.microsoft.com/office/word/2012/wordml" xmlns:w16cex="http://schemas.microsoft.com/office/word/2018/wordml/cex" xmlns:w16cid="http://schemas.microsoft.com/office/word/2016/wordml/cid" xmlns:w16="http://schemas.microsoft.com/office/word/2018/wordml" xmlns:w16du="http://schemas.microsoft.com/office/word/2023/wordml/word16du" xmlns:w16sdtdh="http://schemas.microsoft.com/office/word/2020/wordml/sdtdatahash" xmlns:w16sdtfl="http://schemas.microsoft.com/office/word/2024/wordml/sdtformatlock" xmlns:w16se="http://schemas.microsoft.com/office/word/2015/wordml/symex" xmlns:wpg="http://schemas.microsoft.com/office/word/2010/wordprocessingGroup" xmlns:wpi="http://schemas.microsoft.com/office/word/2010/wordprocessingInk" xmlns:wne="http://schemas.microsoft.com/office/word/2006/wordml" xmlns:wps="http://schemas.microsoft.com/office/word/2010/wordprocessingShape" mc:Ignorable="w14 w15 w16se w16cid w16 w16cex w16sdtdh w16sdtfl w16du wp14">
   <w:body>
     <w:p/>
     <w:p>
@@ -853,19 +853,7 @@
         <w:rPr>
           <w:lang w:val="en-US"/>
         </w:rPr>
-        <w:t>7</w:t>
-      </w:r>
-      <w:r>
-        <w:rPr>
-          <w:lang w:val="en-US"/>
-        </w:rPr>
-        <w:t xml:space="preserve"> </w:t>
-      </w:r>
-      <w:r>
-        <w:rPr>
-          <w:lang w:val="en-US"/>
-        </w:rPr>
-        <w:t>Production logging</w:t>
+        <w:t>7 Production logging</w:t>
       </w:r>
     </w:p>
     <w:p>
@@ -1129,19 +1117,7 @@
         <w:rPr>
           <w:lang w:val="en-US"/>
         </w:rPr>
-        <w:t>8</w:t>
-      </w:r>
-      <w:r>
-        <w:rPr>
-          <w:lang w:val="en-US"/>
-        </w:rPr>
-        <w:t xml:space="preserve"> </w:t>
-      </w:r>
-      <w:r>
-        <w:rPr>
-          <w:lang w:val="en-US"/>
-        </w:rPr>
-        <w:t>Operational Dashboard</w:t>
+        <w:t>8 Operational Dashboard</w:t>
       </w:r>
     </w:p>
     <w:p>
@@ -1343,19 +1319,7 @@
         <w:rPr>
           <w:lang w:val="en-US"/>
         </w:rPr>
-        <w:t>10</w:t>
-      </w:r>
-      <w:r>
-        <w:rPr>
-          <w:lang w:val="en-US"/>
-        </w:rPr>
-        <w:t xml:space="preserve"> </w:t>
-      </w:r>
-      <w:r>
-        <w:rPr>
-          <w:lang w:val="en-US"/>
-        </w:rPr>
-        <w:t>Recommendation engine</w:t>
+        <w:t>10 Recommendation engine</w:t>
       </w:r>
     </w:p>
     <w:p>
@@ -1373,10 +1337,164 @@
     </w:p>
     <w:p>
       <w:pPr>
-        <w:rPr>
-          <w:lang w:val="en-US"/>
-        </w:rPr>
-      </w:pPr>
+        <w:pStyle w:val="Heading1"/>
+        <w:rPr>
+          <w:lang w:val="en-US"/>
+        </w:rPr>
+      </w:pPr>
+      <w:r>
+        <w:rPr>
+          <w:noProof/>
+          <w:lang w:val="en-US"/>
+        </w:rPr>
+        <mc:AlternateContent>
+          <mc:Choice Requires="wps">
+            <w:drawing>
+              <wp:anchor distT="0" distB="0" distL="114300" distR="114300" simplePos="0" relativeHeight="251679744" behindDoc="0" locked="0" layoutInCell="1" allowOverlap="1" wp14:anchorId="123EBED9" wp14:editId="1E6C22A2">
+                <wp:simplePos x="0" y="0"/>
+                <wp:positionH relativeFrom="column">
+                  <wp:posOffset>2455545</wp:posOffset>
+                </wp:positionH>
+                <wp:positionV relativeFrom="paragraph">
+                  <wp:posOffset>257175</wp:posOffset>
+                </wp:positionV>
+                <wp:extent cx="3581400" cy="0"/>
+                <wp:effectExtent l="0" t="0" r="0" b="0"/>
+                <wp:wrapNone/>
+                <wp:docPr id="832606177" name="Straight Connector 1"/>
+                <wp:cNvGraphicFramePr/>
+                <a:graphic xmlns:a="http://schemas.openxmlformats.org/drawingml/2006/main">
+                  <a:graphicData uri="http://schemas.microsoft.com/office/word/2010/wordprocessingShape">
+                    <wps:wsp>
+                      <wps:cNvCnPr/>
+                      <wps:spPr>
+                        <a:xfrm>
+                          <a:off x="0" y="0"/>
+                          <a:ext cx="3581400" cy="0"/>
+                        </a:xfrm>
+                        <a:prstGeom prst="line">
+                          <a:avLst/>
+                        </a:prstGeom>
+                        <a:ln w="19050"/>
+                      </wps:spPr>
+                      <wps:style>
+                        <a:lnRef idx="2">
+                          <a:schemeClr val="accent1"/>
+                        </a:lnRef>
+                        <a:fillRef idx="0">
+                          <a:schemeClr val="accent1"/>
+                        </a:fillRef>
+                        <a:effectRef idx="1">
+                          <a:schemeClr val="accent1"/>
+                        </a:effectRef>
+                        <a:fontRef idx="minor">
+                          <a:schemeClr val="tx1"/>
+                        </a:fontRef>
+                      </wps:style>
+                      <wps:bodyPr/>
+                    </wps:wsp>
+                  </a:graphicData>
+                </a:graphic>
+                <wp14:sizeRelH relativeFrom="margin">
+                  <wp14:pctWidth>0</wp14:pctWidth>
+                </wp14:sizeRelH>
+              </wp:anchor>
+            </w:drawing>
+          </mc:Choice>
+          <mc:Fallback>
+            <w:pict>
+              <v:line w14:anchorId="4FA9020E" id="Straight Connector 1" o:spid="_x0000_s1026" style="position:absolute;z-index:251679744;visibility:visible;mso-wrap-style:square;mso-width-percent:0;mso-wrap-distance-left:9pt;mso-wrap-distance-top:0;mso-wrap-distance-right:9pt;mso-wrap-distance-bottom:0;mso-position-horizontal:absolute;mso-position-horizontal-relative:text;mso-position-vertical:absolute;mso-position-vertical-relative:text;mso-width-percent:0;mso-width-relative:margin" from="193.35pt,20.25pt" to="475.35pt,20.25pt" o:gfxdata="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" strokecolor="#156082 [3204]" strokeweight="1.5pt">
+                <v:stroke joinstyle="miter"/>
+              </v:line>
+            </w:pict>
+          </mc:Fallback>
+        </mc:AlternateContent>
+      </w:r>
+      <w:r>
+        <w:rPr>
+          <w:lang w:val="en-US"/>
+        </w:rPr>
+        <w:t>RF-0</w:t>
+      </w:r>
+      <w:r>
+        <w:rPr>
+          <w:lang w:val="en-US"/>
+        </w:rPr>
+        <w:t>1</w:t>
+      </w:r>
+      <w:r>
+        <w:rPr>
+          <w:lang w:val="en-US"/>
+        </w:rPr>
+        <w:t>1 Intelligence Queries</w:t>
+      </w:r>
+    </w:p>
+    <w:p>
+      <w:pPr>
+        <w:rPr>
+          <w:lang w:val="en-US"/>
+        </w:rPr>
+      </w:pPr>
+      <w:r>
+        <w:rPr>
+          <w:lang w:val="en-US"/>
+        </w:rPr>
+        <w:t xml:space="preserve">The system shall allow for natural language queries. Example: </w:t>
+      </w:r>
+    </w:p>
+    <w:p>
+      <w:pPr>
+        <w:pStyle w:val="ListParagraph"/>
+        <w:numPr>
+          <w:ilvl w:val="0"/>
+          <w:numId w:val="3"/>
+        </w:numPr>
+        <w:rPr>
+          <w:lang w:val="en-US"/>
+        </w:rPr>
+      </w:pPr>
+      <w:r>
+        <w:rPr>
+          <w:lang w:val="en-US"/>
+        </w:rPr>
+        <w:t>Which farm has the least progress?</w:t>
+      </w:r>
+    </w:p>
+    <w:p>
+      <w:pPr>
+        <w:pStyle w:val="ListParagraph"/>
+        <w:numPr>
+          <w:ilvl w:val="0"/>
+          <w:numId w:val="3"/>
+        </w:numPr>
+        <w:rPr>
+          <w:lang w:val="en-US"/>
+        </w:rPr>
+      </w:pPr>
+      <w:r>
+        <w:rPr>
+          <w:lang w:val="en-US"/>
+        </w:rPr>
+        <w:t>Who is the most productivity worker?</w:t>
+      </w:r>
+    </w:p>
+    <w:p>
+      <w:pPr>
+        <w:pStyle w:val="ListParagraph"/>
+        <w:numPr>
+          <w:ilvl w:val="0"/>
+          <w:numId w:val="3"/>
+        </w:numPr>
+        <w:rPr>
+          <w:lang w:val="en-US"/>
+        </w:rPr>
+      </w:pPr>
+      <w:r>
+        <w:rPr>
+          <w:lang w:val="en-US"/>
+        </w:rPr>
+        <w:t>What lot is low?</w:t>
+      </w:r>
     </w:p>
     <w:p>
       <w:pPr>
@@ -1540,7 +1658,7 @@
 </file>
 
 <file path=word/endnotes.xml><?xml version="1.0" encoding="utf-8"?>
-<w:endnotes xmlns:wpc="http://schemas.microsoft.com/office/word/2010/wordprocessingCanvas" xmlns:cx="http://schemas.microsoft.com/office/drawing/2014/chartex" xmlns:cx1="http://schemas.microsoft.com/office/drawing/2015/9/8/chartex" xmlns:cx2="http://schemas.microsoft.com/office/drawing/2015/10/21/chartex" xmlns:cx3="http://schemas.microsoft.com/office/drawing/2016/5/9/chartex" xmlns:cx4="http://schemas.microsoft.com/office/drawing/2016/5/10/chartex" xmlns:cx5="http://schemas.microsoft.com/office/drawing/2016/5/11/chartex" xmlns:cx6="http://schemas.microsoft.com/office/drawing/2016/5/12/chartex" xmlns:cx7="http://schemas.microsoft.com/office/drawing/2016/5/13/chartex" xmlns:cx8="http://schemas.microsoft.com/office/drawing/2016/5/14/chartex" xmlns:mc="http://schemas.openxmlformats.org/markup-compatibility/2006" xmlns:aink="http://schemas.microsoft.com/office/drawing/2016/ink" xmlns:am3d="http://schemas.microsoft.com/office/drawing/2017/model3d" xmlns:o="urn:schemas-microsoft-com:office:office" xmlns:oel="http://schemas.microsoft.com/office/2019/extlst" xmlns:r="http://schemas.openxmlformats.org/officeDocument/2006/relationships" xmlns:m="http://schemas.openxmlformats.org/officeDocument/2006/math" xmlns:v="urn:schemas-microsoft-com:vml" xmlns:wp14="http://schemas.microsoft.com/office/word/2010/wordprocessingDrawing" xmlns:wp="http://schemas.openxmlformats.org/drawingml/2006/wordprocessingDrawing" xmlns:w10="urn:schemas-microsoft-com:office:word" xmlns:w="http://schemas.openxmlformats.org/wordprocessingml/2006/main" xmlns:w14="http://schemas.microsoft.com/office/word/2010/wordml" xmlns:w15="http://schemas.microsoft.com/office/word/2012/wordml" xmlns:w16cex="http://schemas.microsoft.com/office/word/2018/wordml/cex" xmlns:w16cid="http://schemas.microsoft.com/office/word/2016/wordml/cid" xmlns:w16="http://schemas.microsoft.com/office/word/2018/wordml" xmlns:w16du="http://schemas.microsoft.com/office/word/2023/wordml/word16du" xmlns:w16sdtdh="http://schemas.microsoft.com/office/word/2020/wordml/sdtdatahash" xmlns:w16se="http://schemas.microsoft.com/office/word/2015/wordml/symex" xmlns:wpg="http://schemas.microsoft.com/office/word/2010/wordprocessingGroup" xmlns:wpi="http://schemas.microsoft.com/office/word/2010/wordprocessingInk" xmlns:wne="http://schemas.microsoft.com/office/word/2006/wordml" xmlns:wps="http://schemas.microsoft.com/office/word/2010/wordprocessingShape" mc:Ignorable="w14 w15 w16se w16cid w16 w16cex w16sdtdh wp14">
+<w:endnotes xmlns:wpc="http://schemas.microsoft.com/office/word/2010/wordprocessingCanvas" xmlns:cx="http://schemas.microsoft.com/office/drawing/2014/chartex" xmlns:cx1="http://schemas.microsoft.com/office/drawing/2015/9/8/chartex" xmlns:cx2="http://schemas.microsoft.com/office/drawing/2015/10/21/chartex" xmlns:cx3="http://schemas.microsoft.com/office/drawing/2016/5/9/chartex" xmlns:cx4="http://schemas.microsoft.com/office/drawing/2016/5/10/chartex" xmlns:cx5="http://schemas.microsoft.com/office/drawing/2016/5/11/chartex" xmlns:cx6="http://schemas.microsoft.com/office/drawing/2016/5/12/chartex" xmlns:cx7="http://schemas.microsoft.com/office/drawing/2016/5/13/chartex" xmlns:cx8="http://schemas.microsoft.com/office/drawing/2016/5/14/chartex" xmlns:mc="http://schemas.openxmlformats.org/markup-compatibility/2006" xmlns:aink="http://schemas.microsoft.com/office/drawing/2016/ink" xmlns:am3d="http://schemas.microsoft.com/office/drawing/2017/model3d" xmlns:o="urn:schemas-microsoft-com:office:office" xmlns:oel="http://schemas.microsoft.com/office/2019/extlst" xmlns:r="http://schemas.openxmlformats.org/officeDocument/2006/relationships" xmlns:m="http://schemas.openxmlformats.org/officeDocument/2006/math" xmlns:v="urn:schemas-microsoft-com:vml" xmlns:wp14="http://schemas.microsoft.com/office/word/2010/wordprocessingDrawing" xmlns:wp="http://schemas.openxmlformats.org/drawingml/2006/wordprocessingDrawing" xmlns:w10="urn:schemas-microsoft-com:office:word" xmlns:w="http://schemas.openxmlformats.org/wordprocessingml/2006/main" xmlns:w14="http://schemas.microsoft.com/office/word/2010/wordml" xmlns:w15="http://schemas.microsoft.com/office/word/2012/wordml" xmlns:w16cex="http://schemas.microsoft.com/office/word/2018/wordml/cex" xmlns:w16cid="http://schemas.microsoft.com/office/word/2016/wordml/cid" xmlns:w16="http://schemas.microsoft.com/office/word/2018/wordml" xmlns:w16du="http://schemas.microsoft.com/office/word/2023/wordml/word16du" xmlns:w16sdtdh="http://schemas.microsoft.com/office/word/2020/wordml/sdtdatahash" xmlns:w16sdtfl="http://schemas.microsoft.com/office/word/2024/wordml/sdtformatlock" xmlns:w16se="http://schemas.microsoft.com/office/word/2015/wordml/symex" xmlns:wpg="http://schemas.microsoft.com/office/word/2010/wordprocessingGroup" xmlns:wpi="http://schemas.microsoft.com/office/word/2010/wordprocessingInk" xmlns:wne="http://schemas.microsoft.com/office/word/2006/wordml" xmlns:wps="http://schemas.microsoft.com/office/word/2010/wordprocessingShape" mc:Ignorable="w14 w15 w16se w16cid w16 w16cex w16sdtdh w16sdtfl w16du wp14">
   <w:endnote w:type="separator" w:id="-1">
     <w:p>
       <w:pPr>
@@ -1565,7 +1683,7 @@
 </file>
 
 <file path=word/footer1.xml><?xml version="1.0" encoding="utf-8"?>
-<w:ftr xmlns:wpc="http://schemas.microsoft.com/office/word/2010/wordprocessingCanvas" xmlns:cx="http://schemas.microsoft.com/office/drawing/2014/chartex" xmlns:cx1="http://schemas.microsoft.com/office/drawing/2015/9/8/chartex" xmlns:cx2="http://schemas.microsoft.com/office/drawing/2015/10/21/chartex" xmlns:cx3="http://schemas.microsoft.com/office/drawing/2016/5/9/chartex" xmlns:cx4="http://schemas.microsoft.com/office/drawing/2016/5/10/chartex" xmlns:cx5="http://schemas.microsoft.com/office/drawing/2016/5/11/chartex" xmlns:cx6="http://schemas.microsoft.com/office/drawing/2016/5/12/chartex" xmlns:cx7="http://schemas.microsoft.com/office/drawing/2016/5/13/chartex" xmlns:cx8="http://schemas.microsoft.com/office/drawing/2016/5/14/chartex" xmlns:mc="http://schemas.openxmlformats.org/markup-compatibility/2006" xmlns:aink="http://schemas.microsoft.com/office/drawing/2016/ink" xmlns:am3d="http://schemas.microsoft.com/office/drawing/2017/model3d" xmlns:o="urn:schemas-microsoft-com:office:office" xmlns:oel="http://schemas.microsoft.com/office/2019/extlst" xmlns:r="http://schemas.openxmlformats.org/officeDocument/2006/relationships" xmlns:m="http://schemas.openxmlformats.org/officeDocument/2006/math" xmlns:v="urn:schemas-microsoft-com:vml" xmlns:wp14="http://schemas.microsoft.com/office/word/2010/wordprocessingDrawing" xmlns:wp="http://schemas.openxmlformats.org/drawingml/2006/wordprocessingDrawing" xmlns:w10="urn:schemas-microsoft-com:office:word" xmlns:w="http://schemas.openxmlformats.org/wordprocessingml/2006/main" xmlns:w14="http://schemas.microsoft.com/office/word/2010/wordml" xmlns:w15="http://schemas.microsoft.com/office/word/2012/wordml" xmlns:w16cex="http://schemas.microsoft.com/office/word/2018/wordml/cex" xmlns:w16cid="http://schemas.microsoft.com/office/word/2016/wordml/cid" xmlns:w16="http://schemas.microsoft.com/office/word/2018/wordml" xmlns:w16du="http://schemas.microsoft.com/office/word/2023/wordml/word16du" xmlns:w16sdtdh="http://schemas.microsoft.com/office/word/2020/wordml/sdtdatahash" xmlns:w16se="http://schemas.microsoft.com/office/word/2015/wordml/symex" xmlns:wpg="http://schemas.microsoft.com/office/word/2010/wordprocessingGroup" xmlns:wpi="http://schemas.microsoft.com/office/word/2010/wordprocessingInk" xmlns:wne="http://schemas.microsoft.com/office/word/2006/wordml" xmlns:wps="http://schemas.microsoft.com/office/word/2010/wordprocessingShape" mc:Ignorable="w14 w15 w16se w16cid w16 w16cex w16sdtdh wp14">
+<w:ftr xmlns:wpc="http://schemas.microsoft.com/office/word/2010/wordprocessingCanvas" xmlns:cx="http://schemas.microsoft.com/office/drawing/2014/chartex" xmlns:cx1="http://schemas.microsoft.com/office/drawing/2015/9/8/chartex" xmlns:cx2="http://schemas.microsoft.com/office/drawing/2015/10/21/chartex" xmlns:cx3="http://schemas.microsoft.com/office/drawing/2016/5/9/chartex" xmlns:cx4="http://schemas.microsoft.com/office/drawing/2016/5/10/chartex" xmlns:cx5="http://schemas.microsoft.com/office/drawing/2016/5/11/chartex" xmlns:cx6="http://schemas.microsoft.com/office/drawing/2016/5/12/chartex" xmlns:cx7="http://schemas.microsoft.com/office/drawing/2016/5/13/chartex" xmlns:cx8="http://schemas.microsoft.com/office/drawing/2016/5/14/chartex" xmlns:mc="http://schemas.openxmlformats.org/markup-compatibility/2006" xmlns:aink="http://schemas.microsoft.com/office/drawing/2016/ink" xmlns:am3d="http://schemas.microsoft.com/office/drawing/2017/model3d" xmlns:o="urn:schemas-microsoft-com:office:office" xmlns:oel="http://schemas.microsoft.com/office/2019/extlst" xmlns:r="http://schemas.openxmlformats.org/officeDocument/2006/relationships" xmlns:m="http://schemas.openxmlformats.org/officeDocument/2006/math" xmlns:v="urn:schemas-microsoft-com:vml" xmlns:wp14="http://schemas.microsoft.com/office/word/2010/wordprocessingDrawing" xmlns:wp="http://schemas.openxmlformats.org/drawingml/2006/wordprocessingDrawing" xmlns:w10="urn:schemas-microsoft-com:office:word" xmlns:w="http://schemas.openxmlformats.org/wordprocessingml/2006/main" xmlns:w14="http://schemas.microsoft.com/office/word/2010/wordml" xmlns:w15="http://schemas.microsoft.com/office/word/2012/wordml" xmlns:w16cex="http://schemas.microsoft.com/office/word/2018/wordml/cex" xmlns:w16cid="http://schemas.microsoft.com/office/word/2016/wordml/cid" xmlns:w16="http://schemas.microsoft.com/office/word/2018/wordml" xmlns:w16du="http://schemas.microsoft.com/office/word/2023/wordml/word16du" xmlns:w16sdtdh="http://schemas.microsoft.com/office/word/2020/wordml/sdtdatahash" xmlns:w16sdtfl="http://schemas.microsoft.com/office/word/2024/wordml/sdtformatlock" xmlns:w16se="http://schemas.microsoft.com/office/word/2015/wordml/symex" xmlns:wpg="http://schemas.microsoft.com/office/word/2010/wordprocessingGroup" xmlns:wpi="http://schemas.microsoft.com/office/word/2010/wordprocessingInk" xmlns:wne="http://schemas.microsoft.com/office/word/2006/wordml" xmlns:wps="http://schemas.microsoft.com/office/word/2010/wordprocessingShape" mc:Ignorable="w14 w15 w16se w16cid w16 w16cex w16sdtdh w16sdtfl w16du wp14">
   <w:tbl>
     <w:tblPr>
       <w:tblW w:w="5000" w:type="pct"/>
@@ -1713,7 +1831,7 @@
 </file>
 
 <file path=word/footnotes.xml><?xml version="1.0" encoding="utf-8"?>
-<w:footnotes xmlns:wpc="http://schemas.microsoft.com/office/word/2010/wordprocessingCanvas" xmlns:cx="http://schemas.microsoft.com/office/drawing/2014/chartex" xmlns:cx1="http://schemas.microsoft.com/office/drawing/2015/9/8/chartex" xmlns:cx2="http://schemas.microsoft.com/office/drawing/2015/10/21/chartex" xmlns:cx3="http://schemas.microsoft.com/office/drawing/2016/5/9/chartex" xmlns:cx4="http://schemas.microsoft.com/office/drawing/2016/5/10/chartex" xmlns:cx5="http://schemas.microsoft.com/office/drawing/2016/5/11/chartex" xmlns:cx6="http://schemas.microsoft.com/office/drawing/2016/5/12/chartex" xmlns:cx7="http://schemas.microsoft.com/office/drawing/2016/5/13/chartex" xmlns:cx8="http://schemas.microsoft.com/office/drawing/2016/5/14/chartex" xmlns:mc="http://schemas.openxmlformats.org/markup-compatibility/2006" xmlns:aink="http://schemas.microsoft.com/office/drawing/2016/ink" xmlns:am3d="http://schemas.microsoft.com/office/drawing/2017/model3d" xmlns:o="urn:schemas-microsoft-com:office:office" xmlns:oel="http://schemas.microsoft.com/office/2019/extlst" xmlns:r="http://schemas.openxmlformats.org/officeDocument/2006/relationships" xmlns:m="http://schemas.openxmlformats.org/officeDocument/2006/math" xmlns:v="urn:schemas-microsoft-com:vml" xmlns:wp14="http://schemas.microsoft.com/office/word/2010/wordprocessingDrawing" xmlns:wp="http://schemas.openxmlformats.org/drawingml/2006/wordprocessingDrawing" xmlns:w10="urn:schemas-microsoft-com:office:word" xmlns:w="http://schemas.openxmlformats.org/wordprocessingml/2006/main" xmlns:w14="http://schemas.microsoft.com/office/word/2010/wordml" xmlns:w15="http://schemas.microsoft.com/office/word/2012/wordml" xmlns:w16cex="http://schemas.microsoft.com/office/word/2018/wordml/cex" xmlns:w16cid="http://schemas.microsoft.com/office/word/2016/wordml/cid" xmlns:w16="http://schemas.microsoft.com/office/word/2018/wordml" xmlns:w16du="http://schemas.microsoft.com/office/word/2023/wordml/word16du" xmlns:w16sdtdh="http://schemas.microsoft.com/office/word/2020/wordml/sdtdatahash" xmlns:w16se="http://schemas.microsoft.com/office/word/2015/wordml/symex" xmlns:wpg="http://schemas.microsoft.com/office/word/2010/wordprocessingGroup" xmlns:wpi="http://schemas.microsoft.com/office/word/2010/wordprocessingInk" xmlns:wne="http://schemas.microsoft.com/office/word/2006/wordml" xmlns:wps="http://schemas.microsoft.com/office/word/2010/wordprocessingShape" mc:Ignorable="w14 w15 w16se w16cid w16 w16cex w16sdtdh wp14">
+<w:footnotes xmlns:wpc="http://schemas.microsoft.com/office/word/2010/wordprocessingCanvas" xmlns:cx="http://schemas.microsoft.com/office/drawing/2014/chartex" xmlns:cx1="http://schemas.microsoft.com/office/drawing/2015/9/8/chartex" xmlns:cx2="http://schemas.microsoft.com/office/drawing/2015/10/21/chartex" xmlns:cx3="http://schemas.microsoft.com/office/drawing/2016/5/9/chartex" xmlns:cx4="http://schemas.microsoft.com/office/drawing/2016/5/10/chartex" xmlns:cx5="http://schemas.microsoft.com/office/drawing/2016/5/11/chartex" xmlns:cx6="http://schemas.microsoft.com/office/drawing/2016/5/12/chartex" xmlns:cx7="http://schemas.microsoft.com/office/drawing/2016/5/13/chartex" xmlns:cx8="http://schemas.microsoft.com/office/drawing/2016/5/14/chartex" xmlns:mc="http://schemas.openxmlformats.org/markup-compatibility/2006" xmlns:aink="http://schemas.microsoft.com/office/drawing/2016/ink" xmlns:am3d="http://schemas.microsoft.com/office/drawing/2017/model3d" xmlns:o="urn:schemas-microsoft-com:office:office" xmlns:oel="http://schemas.microsoft.com/office/2019/extlst" xmlns:r="http://schemas.openxmlformats.org/officeDocument/2006/relationships" xmlns:m="http://schemas.openxmlformats.org/officeDocument/2006/math" xmlns:v="urn:schemas-microsoft-com:vml" xmlns:wp14="http://schemas.microsoft.com/office/word/2010/wordprocessingDrawing" xmlns:wp="http://schemas.openxmlformats.org/drawingml/2006/wordprocessingDrawing" xmlns:w10="urn:schemas-microsoft-com:office:word" xmlns:w="http://schemas.openxmlformats.org/wordprocessingml/2006/main" xmlns:w14="http://schemas.microsoft.com/office/word/2010/wordml" xmlns:w15="http://schemas.microsoft.com/office/word/2012/wordml" xmlns:w16cex="http://schemas.microsoft.com/office/word/2018/wordml/cex" xmlns:w16cid="http://schemas.microsoft.com/office/word/2016/wordml/cid" xmlns:w16="http://schemas.microsoft.com/office/word/2018/wordml" xmlns:w16du="http://schemas.microsoft.com/office/word/2023/wordml/word16du" xmlns:w16sdtdh="http://schemas.microsoft.com/office/word/2020/wordml/sdtdatahash" xmlns:w16sdtfl="http://schemas.microsoft.com/office/word/2024/wordml/sdtformatlock" xmlns:w16se="http://schemas.microsoft.com/office/word/2015/wordml/symex" xmlns:wpg="http://schemas.microsoft.com/office/word/2010/wordprocessingGroup" xmlns:wpi="http://schemas.microsoft.com/office/word/2010/wordprocessingInk" xmlns:wne="http://schemas.microsoft.com/office/word/2006/wordml" xmlns:wps="http://schemas.microsoft.com/office/word/2010/wordprocessingShape" mc:Ignorable="w14 w15 w16se w16cid w16 w16cex w16sdtdh w16sdtfl w16du wp14">
   <w:footnote w:type="separator" w:id="-1">
     <w:p>
       <w:pPr>
@@ -1738,7 +1856,7 @@
 </file>
 
 <file path=word/header1.xml><?xml version="1.0" encoding="utf-8"?>
-<w:hdr xmlns:wpc="http://schemas.microsoft.com/office/word/2010/wordprocessingCanvas" xmlns:cx="http://schemas.microsoft.com/office/drawing/2014/chartex" xmlns:cx1="http://schemas.microsoft.com/office/drawing/2015/9/8/chartex" xmlns:cx2="http://schemas.microsoft.com/office/drawing/2015/10/21/chartex" xmlns:cx3="http://schemas.microsoft.com/office/drawing/2016/5/9/chartex" xmlns:cx4="http://schemas.microsoft.com/office/drawing/2016/5/10/chartex" xmlns:cx5="http://schemas.microsoft.com/office/drawing/2016/5/11/chartex" xmlns:cx6="http://schemas.microsoft.com/office/drawing/2016/5/12/chartex" xmlns:cx7="http://schemas.microsoft.com/office/drawing/2016/5/13/chartex" xmlns:cx8="http://schemas.microsoft.com/office/drawing/2016/5/14/chartex" xmlns:mc="http://schemas.openxmlformats.org/markup-compatibility/2006" xmlns:aink="http://schemas.microsoft.com/office/drawing/2016/ink" xmlns:am3d="http://schemas.microsoft.com/office/drawing/2017/model3d" xmlns:o="urn:schemas-microsoft-com:office:office" xmlns:oel="http://schemas.microsoft.com/office/2019/extlst" xmlns:r="http://schemas.openxmlformats.org/officeDocument/2006/relationships" xmlns:m="http://schemas.openxmlformats.org/officeDocument/2006/math" xmlns:v="urn:schemas-microsoft-com:vml" xmlns:wp14="http://schemas.microsoft.com/office/word/2010/wordprocessingDrawing" xmlns:wp="http://schemas.openxmlformats.org/drawingml/2006/wordprocessingDrawing" xmlns:w10="urn:schemas-microsoft-com:office:word" xmlns:w="http://schemas.openxmlformats.org/wordprocessingml/2006/main" xmlns:w14="http://schemas.microsoft.com/office/word/2010/wordml" xmlns:w15="http://schemas.microsoft.com/office/word/2012/wordml" xmlns:w16cex="http://schemas.microsoft.com/office/word/2018/wordml/cex" xmlns:w16cid="http://schemas.microsoft.com/office/word/2016/wordml/cid" xmlns:w16="http://schemas.microsoft.com/office/word/2018/wordml" xmlns:w16du="http://schemas.microsoft.com/office/word/2023/wordml/word16du" xmlns:w16sdtdh="http://schemas.microsoft.com/office/word/2020/wordml/sdtdatahash" xmlns:w16se="http://schemas.microsoft.com/office/word/2015/wordml/symex" xmlns:wpg="http://schemas.microsoft.com/office/word/2010/wordprocessingGroup" xmlns:wpi="http://schemas.microsoft.com/office/word/2010/wordprocessingInk" xmlns:wne="http://schemas.microsoft.com/office/word/2006/wordml" xmlns:wps="http://schemas.microsoft.com/office/word/2010/wordprocessingShape" mc:Ignorable="w14 w15 w16se w16cid w16 w16cex w16sdtdh wp14">
+<w:hdr xmlns:wpc="http://schemas.microsoft.com/office/word/2010/wordprocessingCanvas" xmlns:cx="http://schemas.microsoft.com/office/drawing/2014/chartex" xmlns:cx1="http://schemas.microsoft.com/office/drawing/2015/9/8/chartex" xmlns:cx2="http://schemas.microsoft.com/office/drawing/2015/10/21/chartex" xmlns:cx3="http://schemas.microsoft.com/office/drawing/2016/5/9/chartex" xmlns:cx4="http://schemas.microsoft.com/office/drawing/2016/5/10/chartex" xmlns:cx5="http://schemas.microsoft.com/office/drawing/2016/5/11/chartex" xmlns:cx6="http://schemas.microsoft.com/office/drawing/2016/5/12/chartex" xmlns:cx7="http://schemas.microsoft.com/office/drawing/2016/5/13/chartex" xmlns:cx8="http://schemas.microsoft.com/office/drawing/2016/5/14/chartex" xmlns:mc="http://schemas.openxmlformats.org/markup-compatibility/2006" xmlns:aink="http://schemas.microsoft.com/office/drawing/2016/ink" xmlns:am3d="http://schemas.microsoft.com/office/drawing/2017/model3d" xmlns:o="urn:schemas-microsoft-com:office:office" xmlns:oel="http://schemas.microsoft.com/office/2019/extlst" xmlns:r="http://schemas.openxmlformats.org/officeDocument/2006/relationships" xmlns:m="http://schemas.openxmlformats.org/officeDocument/2006/math" xmlns:v="urn:schemas-microsoft-com:vml" xmlns:wp14="http://schemas.microsoft.com/office/word/2010/wordprocessingDrawing" xmlns:wp="http://schemas.openxmlformats.org/drawingml/2006/wordprocessingDrawing" xmlns:w10="urn:schemas-microsoft-com:office:word" xmlns:w="http://schemas.openxmlformats.org/wordprocessingml/2006/main" xmlns:w14="http://schemas.microsoft.com/office/word/2010/wordml" xmlns:w15="http://schemas.microsoft.com/office/word/2012/wordml" xmlns:w16cex="http://schemas.microsoft.com/office/word/2018/wordml/cex" xmlns:w16cid="http://schemas.microsoft.com/office/word/2016/wordml/cid" xmlns:w16="http://schemas.microsoft.com/office/word/2018/wordml" xmlns:w16du="http://schemas.microsoft.com/office/word/2023/wordml/word16du" xmlns:w16sdtdh="http://schemas.microsoft.com/office/word/2020/wordml/sdtdatahash" xmlns:w16sdtfl="http://schemas.microsoft.com/office/word/2024/wordml/sdtformatlock" xmlns:w16se="http://schemas.microsoft.com/office/word/2015/wordml/symex" xmlns:wpg="http://schemas.microsoft.com/office/word/2010/wordprocessingGroup" xmlns:wpi="http://schemas.microsoft.com/office/word/2010/wordprocessingInk" xmlns:wne="http://schemas.microsoft.com/office/word/2006/wordml" xmlns:wps="http://schemas.microsoft.com/office/word/2010/wordprocessingShape" mc:Ignorable="w14 w15 w16se w16cid w16 w16cex w16sdtdh w16sdtfl w16du wp14">
   <w:p>
     <w:pPr>
       <w:pStyle w:val="Header"/>
@@ -1891,11 +2009,11 @@
 </file>
 
 <file path=word/numbering.xml><?xml version="1.0" encoding="utf-8"?>
-<w:numbering xmlns:wpc="http://schemas.microsoft.com/office/word/2010/wordprocessingCanvas" xmlns:cx="http://schemas.microsoft.com/office/drawing/2014/chartex" xmlns:cx1="http://schemas.microsoft.com/office/drawing/2015/9/8/chartex" xmlns:cx2="http://schemas.microsoft.com/office/drawing/2015/10/21/chartex" xmlns:cx3="http://schemas.microsoft.com/office/drawing/2016/5/9/chartex" xmlns:cx4="http://schemas.microsoft.com/office/drawing/2016/5/10/chartex" xmlns:cx5="http://schemas.microsoft.com/office/drawing/2016/5/11/chartex" xmlns:cx6="http://schemas.microsoft.com/office/drawing/2016/5/12/chartex" xmlns:cx7="http://schemas.microsoft.com/office/drawing/2016/5/13/chartex" xmlns:cx8="http://schemas.microsoft.com/office/drawing/2016/5/14/chartex" xmlns:mc="http://schemas.openxmlformats.org/markup-compatibility/2006" xmlns:aink="http://schemas.microsoft.com/office/drawing/2016/ink" xmlns:am3d="http://schemas.microsoft.com/office/drawing/2017/model3d" xmlns:o="urn:schemas-microsoft-com:office:office" xmlns:oel="http://schemas.microsoft.com/office/2019/extlst" xmlns:r="http://schemas.openxmlformats.org/officeDocument/2006/relationships" xmlns:m="http://schemas.openxmlformats.org/officeDocument/2006/math" xmlns:v="urn:schemas-microsoft-com:vml" xmlns:wp14="http://schemas.microsoft.com/office/word/2010/wordprocessingDrawing" xmlns:wp="http://schemas.openxmlformats.org/drawingml/2006/wordprocessingDrawing" xmlns:w10="urn:schemas-microsoft-com:office:word" xmlns:w="http://schemas.openxmlformats.org/wordprocessingml/2006/main" xmlns:w14="http://schemas.microsoft.com/office/word/2010/wordml" xmlns:w15="http://schemas.microsoft.com/office/word/2012/wordml" xmlns:w16cex="http://schemas.microsoft.com/office/word/2018/wordml/cex" xmlns:w16cid="http://schemas.microsoft.com/office/word/2016/wordml/cid" xmlns:w16="http://schemas.microsoft.com/office/word/2018/wordml" xmlns:w16du="http://schemas.microsoft.com/office/word/2023/wordml/word16du" xmlns:w16sdtdh="http://schemas.microsoft.com/office/word/2020/wordml/sdtdatahash" xmlns:w16se="http://schemas.microsoft.com/office/word/2015/wordml/symex" xmlns:wpg="http://schemas.microsoft.com/office/word/2010/wordprocessingGroup" xmlns:wpi="http://schemas.microsoft.com/office/word/2010/wordprocessingInk" xmlns:wne="http://schemas.microsoft.com/office/word/2006/wordml" xmlns:wps="http://schemas.microsoft.com/office/word/2010/wordprocessingShape" mc:Ignorable="w14 w15 w16se w16cid w16 w16cex w16sdtdh wp14">
+<w:numbering xmlns:wpc="http://schemas.microsoft.com/office/word/2010/wordprocessingCanvas" xmlns:cx="http://schemas.microsoft.com/office/drawing/2014/chartex" xmlns:cx1="http://schemas.microsoft.com/office/drawing/2015/9/8/chartex" xmlns:cx2="http://schemas.microsoft.com/office/drawing/2015/10/21/chartex" xmlns:cx3="http://schemas.microsoft.com/office/drawing/2016/5/9/chartex" xmlns:cx4="http://schemas.microsoft.com/office/drawing/2016/5/10/chartex" xmlns:cx5="http://schemas.microsoft.com/office/drawing/2016/5/11/chartex" xmlns:cx6="http://schemas.microsoft.com/office/drawing/2016/5/12/chartex" xmlns:cx7="http://schemas.microsoft.com/office/drawing/2016/5/13/chartex" xmlns:cx8="http://schemas.microsoft.com/office/drawing/2016/5/14/chartex" xmlns:mc="http://schemas.openxmlformats.org/markup-compatibility/2006" xmlns:aink="http://schemas.microsoft.com/office/drawing/2016/ink" xmlns:am3d="http://schemas.microsoft.com/office/drawing/2017/model3d" xmlns:o="urn:schemas-microsoft-com:office:office" xmlns:oel="http://schemas.microsoft.com/office/2019/extlst" xmlns:r="http://schemas.openxmlformats.org/officeDocument/2006/relationships" xmlns:m="http://schemas.openxmlformats.org/officeDocument/2006/math" xmlns:v="urn:schemas-microsoft-com:vml" xmlns:wp14="http://schemas.microsoft.com/office/word/2010/wordprocessingDrawing" xmlns:wp="http://schemas.openxmlformats.org/drawingml/2006/wordprocessingDrawing" xmlns:w10="urn:schemas-microsoft-com:office:word" xmlns:w="http://schemas.openxmlformats.org/wordprocessingml/2006/main" xmlns:w14="http://schemas.microsoft.com/office/word/2010/wordml" xmlns:w15="http://schemas.microsoft.com/office/word/2012/wordml" xmlns:w16cex="http://schemas.microsoft.com/office/word/2018/wordml/cex" xmlns:w16cid="http://schemas.microsoft.com/office/word/2016/wordml/cid" xmlns:w16="http://schemas.microsoft.com/office/word/2018/wordml" xmlns:w16du="http://schemas.microsoft.com/office/word/2023/wordml/word16du" xmlns:w16sdtdh="http://schemas.microsoft.com/office/word/2020/wordml/sdtdatahash" xmlns:w16sdtfl="http://schemas.microsoft.com/office/word/2024/wordml/sdtformatlock" xmlns:w16se="http://schemas.microsoft.com/office/word/2015/wordml/symex" xmlns:wpg="http://schemas.microsoft.com/office/word/2010/wordprocessingGroup" xmlns:wpi="http://schemas.microsoft.com/office/word/2010/wordprocessingInk" xmlns:wne="http://schemas.microsoft.com/office/word/2006/wordml" xmlns:wps="http://schemas.microsoft.com/office/word/2010/wordprocessingShape" mc:Ignorable="w14 w15 w16se w16cid w16 w16cex w16sdtdh w16sdtfl w16du wp14">
   <w:abstractNum w:abstractNumId="0" w15:restartNumberingAfterBreak="0">
-    <w:nsid w:val="5FF63E88"/>
+    <w:nsid w:val="56413AAF"/>
     <w:multiLevelType w:val="hybridMultilevel"/>
-    <w:tmpl w:val="485ED5AA"/>
+    <w:tmpl w:val="18969020"/>
     <w:lvl w:ilvl="0" w:tplc="0C0A0001">
       <w:start w:val="1"/>
       <w:numFmt w:val="bullet"/>
@@ -2006,9 +2124,9 @@
     </w:lvl>
   </w:abstractNum>
   <w:abstractNum w:abstractNumId="1" w15:restartNumberingAfterBreak="0">
-    <w:nsid w:val="78064489"/>
+    <w:nsid w:val="5FF63E88"/>
     <w:multiLevelType w:val="hybridMultilevel"/>
-    <w:tmpl w:val="E0D6173E"/>
+    <w:tmpl w:val="485ED5AA"/>
     <w:lvl w:ilvl="0" w:tplc="0C0A0001">
       <w:start w:val="1"/>
       <w:numFmt w:val="bullet"/>
@@ -2118,17 +2236,133 @@
       </w:rPr>
     </w:lvl>
   </w:abstractNum>
+  <w:abstractNum w:abstractNumId="2" w15:restartNumberingAfterBreak="0">
+    <w:nsid w:val="78064489"/>
+    <w:multiLevelType w:val="hybridMultilevel"/>
+    <w:tmpl w:val="E0D6173E"/>
+    <w:lvl w:ilvl="0" w:tplc="0C0A0001">
+      <w:start w:val="1"/>
+      <w:numFmt w:val="bullet"/>
+      <w:lvlText w:val=""/>
+      <w:lvlJc w:val="left"/>
+      <w:pPr>
+        <w:ind w:left="720" w:hanging="360"/>
+      </w:pPr>
+      <w:rPr>
+        <w:rFonts w:ascii="Symbol" w:hAnsi="Symbol" w:hint="default"/>
+      </w:rPr>
+    </w:lvl>
+    <w:lvl w:ilvl="1" w:tplc="0C0A0003" w:tentative="1">
+      <w:start w:val="1"/>
+      <w:numFmt w:val="bullet"/>
+      <w:lvlText w:val="o"/>
+      <w:lvlJc w:val="left"/>
+      <w:pPr>
+        <w:ind w:left="1440" w:hanging="360"/>
+      </w:pPr>
+      <w:rPr>
+        <w:rFonts w:ascii="Courier New" w:hAnsi="Courier New" w:cs="Courier New" w:hint="default"/>
+      </w:rPr>
+    </w:lvl>
+    <w:lvl w:ilvl="2" w:tplc="0C0A0005" w:tentative="1">
+      <w:start w:val="1"/>
+      <w:numFmt w:val="bullet"/>
+      <w:lvlText w:val=""/>
+      <w:lvlJc w:val="left"/>
+      <w:pPr>
+        <w:ind w:left="2160" w:hanging="360"/>
+      </w:pPr>
+      <w:rPr>
+        <w:rFonts w:ascii="Wingdings" w:hAnsi="Wingdings" w:hint="default"/>
+      </w:rPr>
+    </w:lvl>
+    <w:lvl w:ilvl="3" w:tplc="0C0A0001" w:tentative="1">
+      <w:start w:val="1"/>
+      <w:numFmt w:val="bullet"/>
+      <w:lvlText w:val=""/>
+      <w:lvlJc w:val="left"/>
+      <w:pPr>
+        <w:ind w:left="2880" w:hanging="360"/>
+      </w:pPr>
+      <w:rPr>
+        <w:rFonts w:ascii="Symbol" w:hAnsi="Symbol" w:hint="default"/>
+      </w:rPr>
+    </w:lvl>
+    <w:lvl w:ilvl="4" w:tplc="0C0A0003" w:tentative="1">
+      <w:start w:val="1"/>
+      <w:numFmt w:val="bullet"/>
+      <w:lvlText w:val="o"/>
+      <w:lvlJc w:val="left"/>
+      <w:pPr>
+        <w:ind w:left="3600" w:hanging="360"/>
+      </w:pPr>
+      <w:rPr>
+        <w:rFonts w:ascii="Courier New" w:hAnsi="Courier New" w:cs="Courier New" w:hint="default"/>
+      </w:rPr>
+    </w:lvl>
+    <w:lvl w:ilvl="5" w:tplc="0C0A0005" w:tentative="1">
+      <w:start w:val="1"/>
+      <w:numFmt w:val="bullet"/>
+      <w:lvlText w:val=""/>
+      <w:lvlJc w:val="left"/>
+      <w:pPr>
+        <w:ind w:left="4320" w:hanging="360"/>
+      </w:pPr>
+      <w:rPr>
+        <w:rFonts w:ascii="Wingdings" w:hAnsi="Wingdings" w:hint="default"/>
+      </w:rPr>
+    </w:lvl>
+    <w:lvl w:ilvl="6" w:tplc="0C0A0001" w:tentative="1">
+      <w:start w:val="1"/>
+      <w:numFmt w:val="bullet"/>
+      <w:lvlText w:val=""/>
+      <w:lvlJc w:val="left"/>
+      <w:pPr>
+        <w:ind w:left="5040" w:hanging="360"/>
+      </w:pPr>
+      <w:rPr>
+        <w:rFonts w:ascii="Symbol" w:hAnsi="Symbol" w:hint="default"/>
+      </w:rPr>
+    </w:lvl>
+    <w:lvl w:ilvl="7" w:tplc="0C0A0003" w:tentative="1">
+      <w:start w:val="1"/>
+      <w:numFmt w:val="bullet"/>
+      <w:lvlText w:val="o"/>
+      <w:lvlJc w:val="left"/>
+      <w:pPr>
+        <w:ind w:left="5760" w:hanging="360"/>
+      </w:pPr>
+      <w:rPr>
+        <w:rFonts w:ascii="Courier New" w:hAnsi="Courier New" w:cs="Courier New" w:hint="default"/>
+      </w:rPr>
+    </w:lvl>
+    <w:lvl w:ilvl="8" w:tplc="0C0A0005" w:tentative="1">
+      <w:start w:val="1"/>
+      <w:numFmt w:val="bullet"/>
+      <w:lvlText w:val=""/>
+      <w:lvlJc w:val="left"/>
+      <w:pPr>
+        <w:ind w:left="6480" w:hanging="360"/>
+      </w:pPr>
+      <w:rPr>
+        <w:rFonts w:ascii="Wingdings" w:hAnsi="Wingdings" w:hint="default"/>
+      </w:rPr>
+    </w:lvl>
+  </w:abstractNum>
   <w:num w:numId="1" w16cid:durableId="837577840">
-    <w:abstractNumId w:val="0"/>
+    <w:abstractNumId w:val="1"/>
   </w:num>
   <w:num w:numId="2" w16cid:durableId="230045869">
-    <w:abstractNumId w:val="1"/>
+    <w:abstractNumId w:val="2"/>
+  </w:num>
+  <w:num w:numId="3" w16cid:durableId="509178402">
+    <w:abstractNumId w:val="0"/>
   </w:num>
 </w:numbering>
 </file>
 
 <file path=word/styles.xml><?xml version="1.0" encoding="utf-8"?>
-<w:styles xmlns:mc="http://schemas.openxmlformats.org/markup-compatibility/2006" xmlns:r="http://schemas.openxmlformats.org/officeDocument/2006/relationships" xmlns:w="http://schemas.openxmlformats.org/wordprocessingml/2006/main" xmlns:w14="http://schemas.microsoft.com/office/word/2010/wordml" xmlns:w15="http://schemas.microsoft.com/office/word/2012/wordml" xmlns:w16cex="http://schemas.microsoft.com/office/word/2018/wordml/cex" xmlns:w16cid="http://schemas.microsoft.com/office/word/2016/wordml/cid" xmlns:w16="http://schemas.microsoft.com/office/word/2018/wordml" xmlns:w16sdtdh="http://schemas.microsoft.com/office/word/2020/wordml/sdtdatahash" xmlns:w16se="http://schemas.microsoft.com/office/word/2015/wordml/symex" mc:Ignorable="w14 w15 w16se w16cid w16 w16cex w16sdtdh">
+<w:styles xmlns:mc="http://schemas.openxmlformats.org/markup-compatibility/2006" xmlns:r="http://schemas.openxmlformats.org/officeDocument/2006/relationships" xmlns:w="http://schemas.openxmlformats.org/wordprocessingml/2006/main" xmlns:w14="http://schemas.microsoft.com/office/word/2010/wordml" xmlns:w15="http://schemas.microsoft.com/office/word/2012/wordml" xmlns:w16cex="http://schemas.microsoft.com/office/word/2018/wordml/cex" xmlns:w16cid="http://schemas.microsoft.com/office/word/2016/wordml/cid" xmlns:w16="http://schemas.microsoft.com/office/word/2018/wordml" xmlns:w16du="http://schemas.microsoft.com/office/word/2023/wordml/word16du" xmlns:w16sdtdh="http://schemas.microsoft.com/office/word/2020/wordml/sdtdatahash" xmlns:w16sdtfl="http://schemas.microsoft.com/office/word/2024/wordml/sdtformatlock" xmlns:w16se="http://schemas.microsoft.com/office/word/2015/wordml/symex" mc:Ignorable="w14 w15 w16se w16cid w16 w16cex w16sdtdh w16sdtfl w16du">
   <w:docDefaults>
     <w:rPrDefault>
       <w:rPr>
@@ -2649,7 +2883,7 @@
 </file>
 
 <file path=word/glossary/document.xml><?xml version="1.0" encoding="utf-8"?>
-<w:glossaryDocument xmlns:wpc="http://schemas.microsoft.com/office/word/2010/wordprocessingCanvas" xmlns:cx="http://schemas.microsoft.com/office/drawing/2014/chartex" xmlns:cx1="http://schemas.microsoft.com/office/drawing/2015/9/8/chartex" xmlns:cx2="http://schemas.microsoft.com/office/drawing/2015/10/21/chartex" xmlns:cx3="http://schemas.microsoft.com/office/drawing/2016/5/9/chartex" xmlns:cx4="http://schemas.microsoft.com/office/drawing/2016/5/10/chartex" xmlns:cx5="http://schemas.microsoft.com/office/drawing/2016/5/11/chartex" xmlns:cx6="http://schemas.microsoft.com/office/drawing/2016/5/12/chartex" xmlns:cx7="http://schemas.microsoft.com/office/drawing/2016/5/13/chartex" xmlns:cx8="http://schemas.microsoft.com/office/drawing/2016/5/14/chartex" xmlns:mc="http://schemas.openxmlformats.org/markup-compatibility/2006" xmlns:aink="http://schemas.microsoft.com/office/drawing/2016/ink" xmlns:am3d="http://schemas.microsoft.com/office/drawing/2017/model3d" xmlns:o="urn:schemas-microsoft-com:office:office" xmlns:oel="http://schemas.microsoft.com/office/2019/extlst" xmlns:r="http://schemas.openxmlformats.org/officeDocument/2006/relationships" xmlns:m="http://schemas.openxmlformats.org/officeDocument/2006/math" xmlns:v="urn:schemas-microsoft-com:vml" xmlns:wp14="http://schemas.microsoft.com/office/word/2010/wordprocessingDrawing" xmlns:wp="http://schemas.openxmlformats.org/drawingml/2006/wordprocessingDrawing" xmlns:w10="urn:schemas-microsoft-com:office:word" xmlns:w="http://schemas.openxmlformats.org/wordprocessingml/2006/main" xmlns:w14="http://schemas.microsoft.com/office/word/2010/wordml" xmlns:w15="http://schemas.microsoft.com/office/word/2012/wordml" xmlns:w16cex="http://schemas.microsoft.com/office/word/2018/wordml/cex" xmlns:w16cid="http://schemas.microsoft.com/office/word/2016/wordml/cid" xmlns:w16="http://schemas.microsoft.com/office/word/2018/wordml" xmlns:w16du="http://schemas.microsoft.com/office/word/2023/wordml/word16du" xmlns:w16sdtdh="http://schemas.microsoft.com/office/word/2020/wordml/sdtdatahash" xmlns:w16se="http://schemas.microsoft.com/office/word/2015/wordml/symex" xmlns:wpg="http://schemas.microsoft.com/office/word/2010/wordprocessingGroup" xmlns:wpi="http://schemas.microsoft.com/office/word/2010/wordprocessingInk" xmlns:wne="http://schemas.microsoft.com/office/word/2006/wordml" xmlns:wps="http://schemas.microsoft.com/office/word/2010/wordprocessingShape" mc:Ignorable="w14 w15 w16se w16cid w16 w16cex w16sdtdh wp14">
+<w:glossaryDocument xmlns:wpc="http://schemas.microsoft.com/office/word/2010/wordprocessingCanvas" xmlns:cx="http://schemas.microsoft.com/office/drawing/2014/chartex" xmlns:cx1="http://schemas.microsoft.com/office/drawing/2015/9/8/chartex" xmlns:cx2="http://schemas.microsoft.com/office/drawing/2015/10/21/chartex" xmlns:cx3="http://schemas.microsoft.com/office/drawing/2016/5/9/chartex" xmlns:cx4="http://schemas.microsoft.com/office/drawing/2016/5/10/chartex" xmlns:cx5="http://schemas.microsoft.com/office/drawing/2016/5/11/chartex" xmlns:cx6="http://schemas.microsoft.com/office/drawing/2016/5/12/chartex" xmlns:cx7="http://schemas.microsoft.com/office/drawing/2016/5/13/chartex" xmlns:cx8="http://schemas.microsoft.com/office/drawing/2016/5/14/chartex" xmlns:mc="http://schemas.openxmlformats.org/markup-compatibility/2006" xmlns:aink="http://schemas.microsoft.com/office/drawing/2016/ink" xmlns:am3d="http://schemas.microsoft.com/office/drawing/2017/model3d" xmlns:o="urn:schemas-microsoft-com:office:office" xmlns:oel="http://schemas.microsoft.com/office/2019/extlst" xmlns:r="http://schemas.openxmlformats.org/officeDocument/2006/relationships" xmlns:m="http://schemas.openxmlformats.org/officeDocument/2006/math" xmlns:v="urn:schemas-microsoft-com:vml" xmlns:wp14="http://schemas.microsoft.com/office/word/2010/wordprocessingDrawing" xmlns:wp="http://schemas.openxmlformats.org/drawingml/2006/wordprocessingDrawing" xmlns:w10="urn:schemas-microsoft-com:office:word" xmlns:w="http://schemas.openxmlformats.org/wordprocessingml/2006/main" xmlns:w14="http://schemas.microsoft.com/office/word/2010/wordml" xmlns:w15="http://schemas.microsoft.com/office/word/2012/wordml" xmlns:w16cex="http://schemas.microsoft.com/office/word/2018/wordml/cex" xmlns:w16cid="http://schemas.microsoft.com/office/word/2016/wordml/cid" xmlns:w16="http://schemas.microsoft.com/office/word/2018/wordml" xmlns:w16du="http://schemas.microsoft.com/office/word/2023/wordml/word16du" xmlns:w16sdtdh="http://schemas.microsoft.com/office/word/2020/wordml/sdtdatahash" xmlns:w16sdtfl="http://schemas.microsoft.com/office/word/2024/wordml/sdtformatlock" xmlns:w16se="http://schemas.microsoft.com/office/word/2015/wordml/symex" xmlns:wpg="http://schemas.microsoft.com/office/word/2010/wordprocessingGroup" xmlns:wpi="http://schemas.microsoft.com/office/word/2010/wordprocessingInk" xmlns:wne="http://schemas.microsoft.com/office/word/2006/wordml" xmlns:wps="http://schemas.microsoft.com/office/word/2010/wordprocessingShape" mc:Ignorable="w14 w15 w16se w16cid w16 w16cex w16sdtdh w16sdtfl w16du wp14">
   <w:docParts>
     <w:docPart>
       <w:docPartPr>
@@ -2674,7 +2908,7 @@
           <w:r>
             <w:rPr>
               <w:caps/>
-              <w:color w:val="4472C4" w:themeColor="accent1"/>
+              <w:color w:val="156082" w:themeColor="accent1"/>
               <w:sz w:val="18"/>
               <w:szCs w:val="18"/>
             </w:rPr>
@@ -2706,7 +2940,7 @@
           <w:r>
             <w:rPr>
               <w:caps/>
-              <w:color w:val="4472C4" w:themeColor="accent1"/>
+              <w:color w:val="156082" w:themeColor="accent1"/>
               <w:sz w:val="18"/>
               <w:szCs w:val="18"/>
             </w:rPr>
@@ -2720,7 +2954,7 @@
 </file>
 
 <file path=word/glossary/fontTable.xml><?xml version="1.0" encoding="utf-8"?>
-<w:fonts xmlns:mc="http://schemas.openxmlformats.org/markup-compatibility/2006" xmlns:r="http://schemas.openxmlformats.org/officeDocument/2006/relationships" xmlns:w="http://schemas.openxmlformats.org/wordprocessingml/2006/main" xmlns:w14="http://schemas.microsoft.com/office/word/2010/wordml" xmlns:w15="http://schemas.microsoft.com/office/word/2012/wordml" xmlns:w16cex="http://schemas.microsoft.com/office/word/2018/wordml/cex" xmlns:w16cid="http://schemas.microsoft.com/office/word/2016/wordml/cid" xmlns:w16="http://schemas.microsoft.com/office/word/2018/wordml" xmlns:w16sdtdh="http://schemas.microsoft.com/office/word/2020/wordml/sdtdatahash" xmlns:w16se="http://schemas.microsoft.com/office/word/2015/wordml/symex" mc:Ignorable="w14 w15 w16se w16cid w16 w16cex w16sdtdh">
+<w:fonts xmlns:mc="http://schemas.openxmlformats.org/markup-compatibility/2006" xmlns:r="http://schemas.openxmlformats.org/officeDocument/2006/relationships" xmlns:w="http://schemas.openxmlformats.org/wordprocessingml/2006/main" xmlns:w14="http://schemas.microsoft.com/office/word/2010/wordml" xmlns:w15="http://schemas.microsoft.com/office/word/2012/wordml" xmlns:w16cex="http://schemas.microsoft.com/office/word/2018/wordml/cex" xmlns:w16cid="http://schemas.microsoft.com/office/word/2016/wordml/cid" xmlns:w16="http://schemas.microsoft.com/office/word/2018/wordml" xmlns:w16du="http://schemas.microsoft.com/office/word/2023/wordml/word16du" xmlns:w16sdtdh="http://schemas.microsoft.com/office/word/2020/wordml/sdtdatahash" xmlns:w16sdtfl="http://schemas.microsoft.com/office/word/2024/wordml/sdtformatlock" xmlns:w16se="http://schemas.microsoft.com/office/word/2015/wordml/symex" mc:Ignorable="w14 w15 w16se w16cid w16 w16cex w16sdtdh w16sdtfl w16du">
   <w:font w:name="Symbol">
     <w:panose1 w:val="05050102010706020507"/>
     <w:charset w:val="02"/>
@@ -2768,25 +3002,11 @@
     <w:pitch w:val="variable"/>
     <w:sig w:usb0="00000003" w:usb1="00000000" w:usb2="00000000" w:usb3="00000000" w:csb0="00000001" w:csb1="00000000"/>
   </w:font>
-  <w:font w:name="Calibri">
-    <w:panose1 w:val="020F0502020204030204"/>
-    <w:charset w:val="00"/>
-    <w:family w:val="swiss"/>
-    <w:pitch w:val="variable"/>
-    <w:sig w:usb0="E4002EFF" w:usb1="C200247B" w:usb2="00000009" w:usb3="00000000" w:csb0="000001FF" w:csb1="00000000"/>
-  </w:font>
-  <w:font w:name="Calibri Light">
-    <w:panose1 w:val="020F0302020204030204"/>
-    <w:charset w:val="00"/>
-    <w:family w:val="swiss"/>
-    <w:pitch w:val="variable"/>
-    <w:sig w:usb0="E4002EFF" w:usb1="C200247B" w:usb2="00000009" w:usb3="00000000" w:csb0="000001FF" w:csb1="00000000"/>
-  </w:font>
 </w:fonts>
 </file>
 
 <file path=word/glossary/settings.xml><?xml version="1.0" encoding="utf-8"?>
-<w:settings xmlns:mc="http://schemas.openxmlformats.org/markup-compatibility/2006" xmlns:o="urn:schemas-microsoft-com:office:office" xmlns:r="http://schemas.openxmlformats.org/officeDocument/2006/relationships" xmlns:m="http://schemas.openxmlformats.org/officeDocument/2006/math" xmlns:v="urn:schemas-microsoft-com:vml" xmlns:w10="urn:schemas-microsoft-com:office:word" xmlns:w="http://schemas.openxmlformats.org/wordprocessingml/2006/main" xmlns:w14="http://schemas.microsoft.com/office/word/2010/wordml" xmlns:w15="http://schemas.microsoft.com/office/word/2012/wordml" xmlns:w16cex="http://schemas.microsoft.com/office/word/2018/wordml/cex" xmlns:w16cid="http://schemas.microsoft.com/office/word/2016/wordml/cid" xmlns:w16="http://schemas.microsoft.com/office/word/2018/wordml" xmlns:w16sdtdh="http://schemas.microsoft.com/office/word/2020/wordml/sdtdatahash" xmlns:w16se="http://schemas.microsoft.com/office/word/2015/wordml/symex" xmlns:sl="http://schemas.openxmlformats.org/schemaLibrary/2006/main" mc:Ignorable="w14 w15 w16se w16cid w16 w16cex w16sdtdh">
+<w:settings xmlns:mc="http://schemas.openxmlformats.org/markup-compatibility/2006" xmlns:o="urn:schemas-microsoft-com:office:office" xmlns:r="http://schemas.openxmlformats.org/officeDocument/2006/relationships" xmlns:m="http://schemas.openxmlformats.org/officeDocument/2006/math" xmlns:v="urn:schemas-microsoft-com:vml" xmlns:w10="urn:schemas-microsoft-com:office:word" xmlns:w="http://schemas.openxmlformats.org/wordprocessingml/2006/main" xmlns:w14="http://schemas.microsoft.com/office/word/2010/wordml" xmlns:w15="http://schemas.microsoft.com/office/word/2012/wordml" xmlns:w16cex="http://schemas.microsoft.com/office/word/2018/wordml/cex" xmlns:w16cid="http://schemas.microsoft.com/office/word/2016/wordml/cid" xmlns:w16="http://schemas.microsoft.com/office/word/2018/wordml" xmlns:w16du="http://schemas.microsoft.com/office/word/2023/wordml/word16du" xmlns:w16sdtdh="http://schemas.microsoft.com/office/word/2020/wordml/sdtdatahash" xmlns:w16sdtfl="http://schemas.microsoft.com/office/word/2024/wordml/sdtformatlock" xmlns:w16se="http://schemas.microsoft.com/office/word/2015/wordml/symex" xmlns:sl="http://schemas.openxmlformats.org/schemaLibrary/2006/main" mc:Ignorable="w14 w15 w16se w16cid w16 w16cex w16sdtdh w16sdtfl w16du">
   <w:view w:val="normal"/>
   <w:defaultTabStop w:val="708"/>
   <w:hyphenationZone w:val="425"/>
@@ -2805,7 +3025,9 @@
     <w:rsid w:val="003407EA"/>
     <w:rsid w:val="003872FF"/>
     <w:rsid w:val="00463550"/>
+    <w:rsid w:val="00573545"/>
     <w:rsid w:val="00CA64BE"/>
+    <w:rsid w:val="00F11634"/>
   </w:rsids>
   <m:mathPr>
     <m:mathFont m:val="Cambria Math"/>
@@ -2829,7 +3051,7 @@
 </file>
 
 <file path=word/glossary/styles.xml><?xml version="1.0" encoding="utf-8"?>
-<w:styles xmlns:mc="http://schemas.openxmlformats.org/markup-compatibility/2006" xmlns:r="http://schemas.openxmlformats.org/officeDocument/2006/relationships" xmlns:w="http://schemas.openxmlformats.org/wordprocessingml/2006/main" xmlns:w14="http://schemas.microsoft.com/office/word/2010/wordml" xmlns:w15="http://schemas.microsoft.com/office/word/2012/wordml" xmlns:w16cex="http://schemas.microsoft.com/office/word/2018/wordml/cex" xmlns:w16cid="http://schemas.microsoft.com/office/word/2016/wordml/cid" xmlns:w16="http://schemas.microsoft.com/office/word/2018/wordml" xmlns:w16sdtdh="http://schemas.microsoft.com/office/word/2020/wordml/sdtdatahash" xmlns:w16se="http://schemas.microsoft.com/office/word/2015/wordml/symex" mc:Ignorable="w14 w15 w16se w16cid w16 w16cex w16sdtdh">
+<w:styles xmlns:mc="http://schemas.openxmlformats.org/markup-compatibility/2006" xmlns:r="http://schemas.openxmlformats.org/officeDocument/2006/relationships" xmlns:w="http://schemas.openxmlformats.org/wordprocessingml/2006/main" xmlns:w14="http://schemas.microsoft.com/office/word/2010/wordml" xmlns:w15="http://schemas.microsoft.com/office/word/2012/wordml" xmlns:w16cex="http://schemas.microsoft.com/office/word/2018/wordml/cex" xmlns:w16cid="http://schemas.microsoft.com/office/word/2016/wordml/cid" xmlns:w16="http://schemas.microsoft.com/office/word/2018/wordml" xmlns:w16du="http://schemas.microsoft.com/office/word/2023/wordml/word16du" xmlns:w16sdtdh="http://schemas.microsoft.com/office/word/2020/wordml/sdtdatahash" xmlns:w16sdtfl="http://schemas.microsoft.com/office/word/2024/wordml/sdtformatlock" xmlns:w16se="http://schemas.microsoft.com/office/word/2015/wordml/symex" mc:Ignorable="w14 w15 w16se w16cid w16 w16cex w16sdtdh w16sdtfl w16du">
   <w:docDefaults>
     <w:rPrDefault>
       <w:rPr>
@@ -3268,7 +3490,7 @@
 </file>
 
 <file path=word/glossary/webSettings.xml><?xml version="1.0" encoding="utf-8"?>
-<w:webSettings xmlns:mc="http://schemas.openxmlformats.org/markup-compatibility/2006" xmlns:r="http://schemas.openxmlformats.org/officeDocument/2006/relationships" xmlns:w="http://schemas.openxmlformats.org/wordprocessingml/2006/main" xmlns:w14="http://schemas.microsoft.com/office/word/2010/wordml" xmlns:w15="http://schemas.microsoft.com/office/word/2012/wordml" xmlns:w16cex="http://schemas.microsoft.com/office/word/2018/wordml/cex" xmlns:w16cid="http://schemas.microsoft.com/office/word/2016/wordml/cid" xmlns:w16="http://schemas.microsoft.com/office/word/2018/wordml" xmlns:w16sdtdh="http://schemas.microsoft.com/office/word/2020/wordml/sdtdatahash" xmlns:w16se="http://schemas.microsoft.com/office/word/2015/wordml/symex" mc:Ignorable="w14 w15 w16se w16cid w16 w16cex w16sdtdh">
+<w:webSettings xmlns:mc="http://schemas.openxmlformats.org/markup-compatibility/2006" xmlns:r="http://schemas.openxmlformats.org/officeDocument/2006/relationships" xmlns:w="http://schemas.openxmlformats.org/wordprocessingml/2006/main" xmlns:w14="http://schemas.microsoft.com/office/word/2010/wordml" xmlns:w15="http://schemas.microsoft.com/office/word/2012/wordml" xmlns:w16cex="http://schemas.microsoft.com/office/word/2018/wordml/cex" xmlns:w16cid="http://schemas.microsoft.com/office/word/2016/wordml/cid" xmlns:w16="http://schemas.microsoft.com/office/word/2018/wordml" xmlns:w16du="http://schemas.microsoft.com/office/word/2023/wordml/word16du" xmlns:w16sdtdh="http://schemas.microsoft.com/office/word/2020/wordml/sdtdatahash" xmlns:w16sdtfl="http://schemas.microsoft.com/office/word/2024/wordml/sdtformatlock" xmlns:w16se="http://schemas.microsoft.com/office/word/2015/wordml/symex" mc:Ignorable="w14 w15 w16se w16cid w16 w16cex w16sdtdh w16sdtfl w16du">
   <w:optimizeForBrowser/>
   <w:allowPNG/>
 </w:webSettings>

</xml_diff>